<commit_message>
docs: cambio en la arquitectura, se saco candy
</commit_message>
<xml_diff>
--- a/FASE 2/Evidencias Proyecto/Documentacion/Documento de arquitectura.docx
+++ b/FASE 2/Evidencias Proyecto/Documentacion/Documento de arquitectura.docx
@@ -200,41 +200,11 @@
           <w:rFonts w:ascii="Calibri" w:hAnsi="Calibri" w:cs="Calibri"/>
         </w:rPr>
         <w:t>Integrantes: Alejandro Silva</w:t>
-      </w:r>
-      <w:r>
-        <w:rPr>
-          <w:rFonts w:ascii="Calibri" w:hAnsi="Calibri" w:cs="Calibri"/>
-        </w:rPr>
         <w:tab/>
-      </w:r>
-      <w:r>
-        <w:rPr>
-          <w:rFonts w:ascii="Calibri" w:hAnsi="Calibri" w:cs="Calibri"/>
-        </w:rPr>
         <w:tab/>
-      </w:r>
-      <w:r>
-        <w:rPr>
-          <w:rFonts w:ascii="Calibri" w:hAnsi="Calibri" w:cs="Calibri"/>
-        </w:rPr>
         <w:tab/>
-      </w:r>
-      <w:r>
-        <w:rPr>
-          <w:rFonts w:ascii="Calibri" w:hAnsi="Calibri" w:cs="Calibri"/>
-        </w:rPr>
         <w:tab/>
-      </w:r>
-      <w:r>
-        <w:rPr>
-          <w:rFonts w:ascii="Calibri" w:hAnsi="Calibri" w:cs="Calibri"/>
-        </w:rPr>
         <w:tab/>
-      </w:r>
-      <w:r>
-        <w:rPr>
-          <w:rFonts w:ascii="Calibri" w:hAnsi="Calibri" w:cs="Calibri"/>
-        </w:rPr>
         <w:tab/>
         <w:t>Docente: Maria Cobo</w:t>
       </w:r>
@@ -297,11 +267,7 @@
           </w:pPr>
           <w:r>
             <w:fldChar w:fldCharType="begin"/>
-          </w:r>
-          <w:r>
             <w:instrText xml:space="preserve"> TOC \o "1-2" \h \z \u </w:instrText>
-          </w:r>
-          <w:r>
             <w:fldChar w:fldCharType="separate"/>
           </w:r>
           <w:hyperlink w:anchor="_Toc241950734" w:history="1">
@@ -319,46 +285,10 @@
                 <w:webHidden/>
               </w:rPr>
               <w:tab/>
-            </w:r>
-            <w:r>
-              <w:rPr>
-                <w:noProof/>
-                <w:webHidden/>
-              </w:rPr>
               <w:fldChar w:fldCharType="begin"/>
-            </w:r>
-            <w:r>
-              <w:rPr>
-                <w:noProof/>
-                <w:webHidden/>
-              </w:rPr>
               <w:instrText xml:space="preserve"> PAGEREF _Toc241950734 \h </w:instrText>
-            </w:r>
-            <w:r>
-              <w:rPr>
-                <w:noProof/>
-                <w:webHidden/>
-              </w:rPr>
-            </w:r>
-            <w:r>
-              <w:rPr>
-                <w:noProof/>
-                <w:webHidden/>
-              </w:rPr>
               <w:fldChar w:fldCharType="separate"/>
-            </w:r>
-            <w:r>
-              <w:rPr>
-                <w:noProof/>
-                <w:webHidden/>
-              </w:rPr>
               <w:t>3</w:t>
-            </w:r>
-            <w:r>
-              <w:rPr>
-                <w:noProof/>
-                <w:webHidden/>
-              </w:rPr>
               <w:fldChar w:fldCharType="end"/>
             </w:r>
           </w:hyperlink>
@@ -390,46 +320,10 @@
                 <w:webHidden/>
               </w:rPr>
               <w:tab/>
-            </w:r>
-            <w:r>
-              <w:rPr>
-                <w:noProof/>
-                <w:webHidden/>
-              </w:rPr>
               <w:fldChar w:fldCharType="begin"/>
-            </w:r>
-            <w:r>
-              <w:rPr>
-                <w:noProof/>
-                <w:webHidden/>
-              </w:rPr>
               <w:instrText xml:space="preserve"> PAGEREF _Toc241950735 \h </w:instrText>
-            </w:r>
-            <w:r>
-              <w:rPr>
-                <w:noProof/>
-                <w:webHidden/>
-              </w:rPr>
-            </w:r>
-            <w:r>
-              <w:rPr>
-                <w:noProof/>
-                <w:webHidden/>
-              </w:rPr>
               <w:fldChar w:fldCharType="separate"/>
-            </w:r>
-            <w:r>
-              <w:rPr>
-                <w:noProof/>
-                <w:webHidden/>
-              </w:rPr>
               <w:t>3</w:t>
-            </w:r>
-            <w:r>
-              <w:rPr>
-                <w:noProof/>
-                <w:webHidden/>
-              </w:rPr>
               <w:fldChar w:fldCharType="end"/>
             </w:r>
           </w:hyperlink>
@@ -461,46 +355,10 @@
                 <w:webHidden/>
               </w:rPr>
               <w:tab/>
-            </w:r>
-            <w:r>
-              <w:rPr>
-                <w:noProof/>
-                <w:webHidden/>
-              </w:rPr>
               <w:fldChar w:fldCharType="begin"/>
-            </w:r>
-            <w:r>
-              <w:rPr>
-                <w:noProof/>
-                <w:webHidden/>
-              </w:rPr>
               <w:instrText xml:space="preserve"> PAGEREF _Toc241950736 \h </w:instrText>
-            </w:r>
-            <w:r>
-              <w:rPr>
-                <w:noProof/>
-                <w:webHidden/>
-              </w:rPr>
-            </w:r>
-            <w:r>
-              <w:rPr>
-                <w:noProof/>
-                <w:webHidden/>
-              </w:rPr>
               <w:fldChar w:fldCharType="separate"/>
-            </w:r>
-            <w:r>
-              <w:rPr>
-                <w:noProof/>
-                <w:webHidden/>
-              </w:rPr>
               <w:t>4</w:t>
-            </w:r>
-            <w:r>
-              <w:rPr>
-                <w:noProof/>
-                <w:webHidden/>
-              </w:rPr>
               <w:fldChar w:fldCharType="end"/>
             </w:r>
           </w:hyperlink>
@@ -532,46 +390,10 @@
                 <w:webHidden/>
               </w:rPr>
               <w:tab/>
-            </w:r>
-            <w:r>
-              <w:rPr>
-                <w:noProof/>
-                <w:webHidden/>
-              </w:rPr>
               <w:fldChar w:fldCharType="begin"/>
-            </w:r>
-            <w:r>
-              <w:rPr>
-                <w:noProof/>
-                <w:webHidden/>
-              </w:rPr>
               <w:instrText xml:space="preserve"> PAGEREF _Toc241950737 \h </w:instrText>
-            </w:r>
-            <w:r>
-              <w:rPr>
-                <w:noProof/>
-                <w:webHidden/>
-              </w:rPr>
-            </w:r>
-            <w:r>
-              <w:rPr>
-                <w:noProof/>
-                <w:webHidden/>
-              </w:rPr>
               <w:fldChar w:fldCharType="separate"/>
-            </w:r>
-            <w:r>
-              <w:rPr>
-                <w:noProof/>
-                <w:webHidden/>
-              </w:rPr>
               <w:t>4</w:t>
-            </w:r>
-            <w:r>
-              <w:rPr>
-                <w:noProof/>
-                <w:webHidden/>
-              </w:rPr>
               <w:fldChar w:fldCharType="end"/>
             </w:r>
           </w:hyperlink>
@@ -603,46 +425,10 @@
                 <w:webHidden/>
               </w:rPr>
               <w:tab/>
-            </w:r>
-            <w:r>
-              <w:rPr>
-                <w:noProof/>
-                <w:webHidden/>
-              </w:rPr>
               <w:fldChar w:fldCharType="begin"/>
-            </w:r>
-            <w:r>
-              <w:rPr>
-                <w:noProof/>
-                <w:webHidden/>
-              </w:rPr>
               <w:instrText xml:space="preserve"> PAGEREF _Toc241950738 \h </w:instrText>
-            </w:r>
-            <w:r>
-              <w:rPr>
-                <w:noProof/>
-                <w:webHidden/>
-              </w:rPr>
-            </w:r>
-            <w:r>
-              <w:rPr>
-                <w:noProof/>
-                <w:webHidden/>
-              </w:rPr>
               <w:fldChar w:fldCharType="separate"/>
-            </w:r>
-            <w:r>
-              <w:rPr>
-                <w:noProof/>
-                <w:webHidden/>
-              </w:rPr>
               <w:t>4</w:t>
-            </w:r>
-            <w:r>
-              <w:rPr>
-                <w:noProof/>
-                <w:webHidden/>
-              </w:rPr>
               <w:fldChar w:fldCharType="end"/>
             </w:r>
           </w:hyperlink>
@@ -674,46 +460,10 @@
                 <w:webHidden/>
               </w:rPr>
               <w:tab/>
-            </w:r>
-            <w:r>
-              <w:rPr>
-                <w:noProof/>
-                <w:webHidden/>
-              </w:rPr>
               <w:fldChar w:fldCharType="begin"/>
-            </w:r>
-            <w:r>
-              <w:rPr>
-                <w:noProof/>
-                <w:webHidden/>
-              </w:rPr>
               <w:instrText xml:space="preserve"> PAGEREF _Toc241950739 \h </w:instrText>
-            </w:r>
-            <w:r>
-              <w:rPr>
-                <w:noProof/>
-                <w:webHidden/>
-              </w:rPr>
-            </w:r>
-            <w:r>
-              <w:rPr>
-                <w:noProof/>
-                <w:webHidden/>
-              </w:rPr>
               <w:fldChar w:fldCharType="separate"/>
-            </w:r>
-            <w:r>
-              <w:rPr>
-                <w:noProof/>
-                <w:webHidden/>
-              </w:rPr>
               <w:t>4</w:t>
-            </w:r>
-            <w:r>
-              <w:rPr>
-                <w:noProof/>
-                <w:webHidden/>
-              </w:rPr>
               <w:fldChar w:fldCharType="end"/>
             </w:r>
           </w:hyperlink>
@@ -745,46 +495,10 @@
                 <w:webHidden/>
               </w:rPr>
               <w:tab/>
-            </w:r>
-            <w:r>
-              <w:rPr>
-                <w:noProof/>
-                <w:webHidden/>
-              </w:rPr>
               <w:fldChar w:fldCharType="begin"/>
-            </w:r>
-            <w:r>
-              <w:rPr>
-                <w:noProof/>
-                <w:webHidden/>
-              </w:rPr>
               <w:instrText xml:space="preserve"> PAGEREF _Toc241950740 \h </w:instrText>
-            </w:r>
-            <w:r>
-              <w:rPr>
-                <w:noProof/>
-                <w:webHidden/>
-              </w:rPr>
-            </w:r>
-            <w:r>
-              <w:rPr>
-                <w:noProof/>
-                <w:webHidden/>
-              </w:rPr>
               <w:fldChar w:fldCharType="separate"/>
-            </w:r>
-            <w:r>
-              <w:rPr>
-                <w:noProof/>
-                <w:webHidden/>
-              </w:rPr>
               <w:t>5</w:t>
-            </w:r>
-            <w:r>
-              <w:rPr>
-                <w:noProof/>
-                <w:webHidden/>
-              </w:rPr>
               <w:fldChar w:fldCharType="end"/>
             </w:r>
           </w:hyperlink>
@@ -816,46 +530,10 @@
                 <w:webHidden/>
               </w:rPr>
               <w:tab/>
-            </w:r>
-            <w:r>
-              <w:rPr>
-                <w:noProof/>
-                <w:webHidden/>
-              </w:rPr>
               <w:fldChar w:fldCharType="begin"/>
-            </w:r>
-            <w:r>
-              <w:rPr>
-                <w:noProof/>
-                <w:webHidden/>
-              </w:rPr>
               <w:instrText xml:space="preserve"> PAGEREF _Toc241950741 \h </w:instrText>
-            </w:r>
-            <w:r>
-              <w:rPr>
-                <w:noProof/>
-                <w:webHidden/>
-              </w:rPr>
-            </w:r>
-            <w:r>
-              <w:rPr>
-                <w:noProof/>
-                <w:webHidden/>
-              </w:rPr>
               <w:fldChar w:fldCharType="separate"/>
-            </w:r>
-            <w:r>
-              <w:rPr>
-                <w:noProof/>
-                <w:webHidden/>
-              </w:rPr>
               <w:t>6</w:t>
-            </w:r>
-            <w:r>
-              <w:rPr>
-                <w:noProof/>
-                <w:webHidden/>
-              </w:rPr>
               <w:fldChar w:fldCharType="end"/>
             </w:r>
           </w:hyperlink>
@@ -887,46 +565,10 @@
                 <w:webHidden/>
               </w:rPr>
               <w:tab/>
-            </w:r>
-            <w:r>
-              <w:rPr>
-                <w:noProof/>
-                <w:webHidden/>
-              </w:rPr>
               <w:fldChar w:fldCharType="begin"/>
-            </w:r>
-            <w:r>
-              <w:rPr>
-                <w:noProof/>
-                <w:webHidden/>
-              </w:rPr>
               <w:instrText xml:space="preserve"> PAGEREF _Toc241950742 \h </w:instrText>
-            </w:r>
-            <w:r>
-              <w:rPr>
-                <w:noProof/>
-                <w:webHidden/>
-              </w:rPr>
-            </w:r>
-            <w:r>
-              <w:rPr>
-                <w:noProof/>
-                <w:webHidden/>
-              </w:rPr>
               <w:fldChar w:fldCharType="separate"/>
-            </w:r>
-            <w:r>
-              <w:rPr>
-                <w:noProof/>
-                <w:webHidden/>
-              </w:rPr>
               <w:t>6</w:t>
-            </w:r>
-            <w:r>
-              <w:rPr>
-                <w:noProof/>
-                <w:webHidden/>
-              </w:rPr>
               <w:fldChar w:fldCharType="end"/>
             </w:r>
           </w:hyperlink>
@@ -958,46 +600,10 @@
                 <w:webHidden/>
               </w:rPr>
               <w:tab/>
-            </w:r>
-            <w:r>
-              <w:rPr>
-                <w:noProof/>
-                <w:webHidden/>
-              </w:rPr>
               <w:fldChar w:fldCharType="begin"/>
-            </w:r>
-            <w:r>
-              <w:rPr>
-                <w:noProof/>
-                <w:webHidden/>
-              </w:rPr>
               <w:instrText xml:space="preserve"> PAGEREF _Toc241950743 \h </w:instrText>
-            </w:r>
-            <w:r>
-              <w:rPr>
-                <w:noProof/>
-                <w:webHidden/>
-              </w:rPr>
-            </w:r>
-            <w:r>
-              <w:rPr>
-                <w:noProof/>
-                <w:webHidden/>
-              </w:rPr>
               <w:fldChar w:fldCharType="separate"/>
-            </w:r>
-            <w:r>
-              <w:rPr>
-                <w:noProof/>
-                <w:webHidden/>
-              </w:rPr>
               <w:t>7</w:t>
-            </w:r>
-            <w:r>
-              <w:rPr>
-                <w:noProof/>
-                <w:webHidden/>
-              </w:rPr>
               <w:fldChar w:fldCharType="end"/>
             </w:r>
           </w:hyperlink>
@@ -1029,46 +635,10 @@
                 <w:webHidden/>
               </w:rPr>
               <w:tab/>
-            </w:r>
-            <w:r>
-              <w:rPr>
-                <w:noProof/>
-                <w:webHidden/>
-              </w:rPr>
               <w:fldChar w:fldCharType="begin"/>
-            </w:r>
-            <w:r>
-              <w:rPr>
-                <w:noProof/>
-                <w:webHidden/>
-              </w:rPr>
               <w:instrText xml:space="preserve"> PAGEREF _Toc241950744 \h </w:instrText>
-            </w:r>
-            <w:r>
-              <w:rPr>
-                <w:noProof/>
-                <w:webHidden/>
-              </w:rPr>
-            </w:r>
-            <w:r>
-              <w:rPr>
-                <w:noProof/>
-                <w:webHidden/>
-              </w:rPr>
               <w:fldChar w:fldCharType="separate"/>
-            </w:r>
-            <w:r>
-              <w:rPr>
-                <w:noProof/>
-                <w:webHidden/>
-              </w:rPr>
               <w:t>8</w:t>
-            </w:r>
-            <w:r>
-              <w:rPr>
-                <w:noProof/>
-                <w:webHidden/>
-              </w:rPr>
               <w:fldChar w:fldCharType="end"/>
             </w:r>
           </w:hyperlink>
@@ -1100,46 +670,10 @@
                 <w:webHidden/>
               </w:rPr>
               <w:tab/>
-            </w:r>
-            <w:r>
-              <w:rPr>
-                <w:noProof/>
-                <w:webHidden/>
-              </w:rPr>
               <w:fldChar w:fldCharType="begin"/>
-            </w:r>
-            <w:r>
-              <w:rPr>
-                <w:noProof/>
-                <w:webHidden/>
-              </w:rPr>
               <w:instrText xml:space="preserve"> PAGEREF _Toc241950745 \h </w:instrText>
-            </w:r>
-            <w:r>
-              <w:rPr>
-                <w:noProof/>
-                <w:webHidden/>
-              </w:rPr>
-            </w:r>
-            <w:r>
-              <w:rPr>
-                <w:noProof/>
-                <w:webHidden/>
-              </w:rPr>
               <w:fldChar w:fldCharType="separate"/>
-            </w:r>
-            <w:r>
-              <w:rPr>
-                <w:noProof/>
-                <w:webHidden/>
-              </w:rPr>
               <w:t>9</w:t>
-            </w:r>
-            <w:r>
-              <w:rPr>
-                <w:noProof/>
-                <w:webHidden/>
-              </w:rPr>
               <w:fldChar w:fldCharType="end"/>
             </w:r>
           </w:hyperlink>
@@ -1171,46 +705,10 @@
                 <w:webHidden/>
               </w:rPr>
               <w:tab/>
-            </w:r>
-            <w:r>
-              <w:rPr>
-                <w:noProof/>
-                <w:webHidden/>
-              </w:rPr>
               <w:fldChar w:fldCharType="begin"/>
-            </w:r>
-            <w:r>
-              <w:rPr>
-                <w:noProof/>
-                <w:webHidden/>
-              </w:rPr>
               <w:instrText xml:space="preserve"> PAGEREF _Toc241950746 \h </w:instrText>
-            </w:r>
-            <w:r>
-              <w:rPr>
-                <w:noProof/>
-                <w:webHidden/>
-              </w:rPr>
-            </w:r>
-            <w:r>
-              <w:rPr>
-                <w:noProof/>
-                <w:webHidden/>
-              </w:rPr>
               <w:fldChar w:fldCharType="separate"/>
-            </w:r>
-            <w:r>
-              <w:rPr>
-                <w:noProof/>
-                <w:webHidden/>
-              </w:rPr>
               <w:t>10</w:t>
-            </w:r>
-            <w:r>
-              <w:rPr>
-                <w:noProof/>
-                <w:webHidden/>
-              </w:rPr>
               <w:fldChar w:fldCharType="end"/>
             </w:r>
           </w:hyperlink>
@@ -1242,46 +740,10 @@
                 <w:webHidden/>
               </w:rPr>
               <w:tab/>
-            </w:r>
-            <w:r>
-              <w:rPr>
-                <w:noProof/>
-                <w:webHidden/>
-              </w:rPr>
               <w:fldChar w:fldCharType="begin"/>
-            </w:r>
-            <w:r>
-              <w:rPr>
-                <w:noProof/>
-                <w:webHidden/>
-              </w:rPr>
               <w:instrText xml:space="preserve"> PAGEREF _Toc241950747 \h </w:instrText>
-            </w:r>
-            <w:r>
-              <w:rPr>
-                <w:noProof/>
-                <w:webHidden/>
-              </w:rPr>
-            </w:r>
-            <w:r>
-              <w:rPr>
-                <w:noProof/>
-                <w:webHidden/>
-              </w:rPr>
               <w:fldChar w:fldCharType="separate"/>
-            </w:r>
-            <w:r>
-              <w:rPr>
-                <w:noProof/>
-                <w:webHidden/>
-              </w:rPr>
               <w:t>11</w:t>
-            </w:r>
-            <w:r>
-              <w:rPr>
-                <w:noProof/>
-                <w:webHidden/>
-              </w:rPr>
               <w:fldChar w:fldCharType="end"/>
             </w:r>
           </w:hyperlink>
@@ -1313,46 +775,10 @@
                 <w:webHidden/>
               </w:rPr>
               <w:tab/>
-            </w:r>
-            <w:r>
-              <w:rPr>
-                <w:noProof/>
-                <w:webHidden/>
-              </w:rPr>
               <w:fldChar w:fldCharType="begin"/>
-            </w:r>
-            <w:r>
-              <w:rPr>
-                <w:noProof/>
-                <w:webHidden/>
-              </w:rPr>
               <w:instrText xml:space="preserve"> PAGEREF _Toc241950748 \h </w:instrText>
-            </w:r>
-            <w:r>
-              <w:rPr>
-                <w:noProof/>
-                <w:webHidden/>
-              </w:rPr>
-            </w:r>
-            <w:r>
-              <w:rPr>
-                <w:noProof/>
-                <w:webHidden/>
-              </w:rPr>
               <w:fldChar w:fldCharType="separate"/>
-            </w:r>
-            <w:r>
-              <w:rPr>
-                <w:noProof/>
-                <w:webHidden/>
-              </w:rPr>
               <w:t>12</w:t>
-            </w:r>
-            <w:r>
-              <w:rPr>
-                <w:noProof/>
-                <w:webHidden/>
-              </w:rPr>
               <w:fldChar w:fldCharType="end"/>
             </w:r>
           </w:hyperlink>
@@ -1384,46 +810,10 @@
                 <w:webHidden/>
               </w:rPr>
               <w:tab/>
-            </w:r>
-            <w:r>
-              <w:rPr>
-                <w:noProof/>
-                <w:webHidden/>
-              </w:rPr>
               <w:fldChar w:fldCharType="begin"/>
-            </w:r>
-            <w:r>
-              <w:rPr>
-                <w:noProof/>
-                <w:webHidden/>
-              </w:rPr>
               <w:instrText xml:space="preserve"> PAGEREF _Toc241950749 \h </w:instrText>
-            </w:r>
-            <w:r>
-              <w:rPr>
-                <w:noProof/>
-                <w:webHidden/>
-              </w:rPr>
-            </w:r>
-            <w:r>
-              <w:rPr>
-                <w:noProof/>
-                <w:webHidden/>
-              </w:rPr>
               <w:fldChar w:fldCharType="separate"/>
-            </w:r>
-            <w:r>
-              <w:rPr>
-                <w:noProof/>
-                <w:webHidden/>
-              </w:rPr>
               <w:t>13</w:t>
-            </w:r>
-            <w:r>
-              <w:rPr>
-                <w:noProof/>
-                <w:webHidden/>
-              </w:rPr>
               <w:fldChar w:fldCharType="end"/>
             </w:r>
           </w:hyperlink>
@@ -1455,46 +845,10 @@
                 <w:webHidden/>
               </w:rPr>
               <w:tab/>
-            </w:r>
-            <w:r>
-              <w:rPr>
-                <w:noProof/>
-                <w:webHidden/>
-              </w:rPr>
               <w:fldChar w:fldCharType="begin"/>
-            </w:r>
-            <w:r>
-              <w:rPr>
-                <w:noProof/>
-                <w:webHidden/>
-              </w:rPr>
               <w:instrText xml:space="preserve"> PAGEREF _Toc241950750 \h </w:instrText>
-            </w:r>
-            <w:r>
-              <w:rPr>
-                <w:noProof/>
-                <w:webHidden/>
-              </w:rPr>
-            </w:r>
-            <w:r>
-              <w:rPr>
-                <w:noProof/>
-                <w:webHidden/>
-              </w:rPr>
               <w:fldChar w:fldCharType="separate"/>
-            </w:r>
-            <w:r>
-              <w:rPr>
-                <w:noProof/>
-                <w:webHidden/>
-              </w:rPr>
               <w:t>13</w:t>
-            </w:r>
-            <w:r>
-              <w:rPr>
-                <w:noProof/>
-                <w:webHidden/>
-              </w:rPr>
               <w:fldChar w:fldCharType="end"/>
             </w:r>
           </w:hyperlink>
@@ -1526,46 +880,10 @@
                 <w:webHidden/>
               </w:rPr>
               <w:tab/>
-            </w:r>
-            <w:r>
-              <w:rPr>
-                <w:noProof/>
-                <w:webHidden/>
-              </w:rPr>
               <w:fldChar w:fldCharType="begin"/>
-            </w:r>
-            <w:r>
-              <w:rPr>
-                <w:noProof/>
-                <w:webHidden/>
-              </w:rPr>
               <w:instrText xml:space="preserve"> PAGEREF _Toc241950751 \h </w:instrText>
-            </w:r>
-            <w:r>
-              <w:rPr>
-                <w:noProof/>
-                <w:webHidden/>
-              </w:rPr>
-            </w:r>
-            <w:r>
-              <w:rPr>
-                <w:noProof/>
-                <w:webHidden/>
-              </w:rPr>
               <w:fldChar w:fldCharType="separate"/>
-            </w:r>
-            <w:r>
-              <w:rPr>
-                <w:noProof/>
-                <w:webHidden/>
-              </w:rPr>
               <w:t>14</w:t>
-            </w:r>
-            <w:r>
-              <w:rPr>
-                <w:noProof/>
-                <w:webHidden/>
-              </w:rPr>
               <w:fldChar w:fldCharType="end"/>
             </w:r>
           </w:hyperlink>
@@ -1597,46 +915,10 @@
                 <w:webHidden/>
               </w:rPr>
               <w:tab/>
-            </w:r>
-            <w:r>
-              <w:rPr>
-                <w:noProof/>
-                <w:webHidden/>
-              </w:rPr>
               <w:fldChar w:fldCharType="begin"/>
-            </w:r>
-            <w:r>
-              <w:rPr>
-                <w:noProof/>
-                <w:webHidden/>
-              </w:rPr>
               <w:instrText xml:space="preserve"> PAGEREF _Toc241950752 \h </w:instrText>
-            </w:r>
-            <w:r>
-              <w:rPr>
-                <w:noProof/>
-                <w:webHidden/>
-              </w:rPr>
-            </w:r>
-            <w:r>
-              <w:rPr>
-                <w:noProof/>
-                <w:webHidden/>
-              </w:rPr>
               <w:fldChar w:fldCharType="separate"/>
-            </w:r>
-            <w:r>
-              <w:rPr>
-                <w:noProof/>
-                <w:webHidden/>
-              </w:rPr>
               <w:t>15</w:t>
-            </w:r>
-            <w:r>
-              <w:rPr>
-                <w:noProof/>
-                <w:webHidden/>
-              </w:rPr>
               <w:fldChar w:fldCharType="end"/>
             </w:r>
           </w:hyperlink>
@@ -1668,46 +950,10 @@
                 <w:webHidden/>
               </w:rPr>
               <w:tab/>
-            </w:r>
-            <w:r>
-              <w:rPr>
-                <w:noProof/>
-                <w:webHidden/>
-              </w:rPr>
               <w:fldChar w:fldCharType="begin"/>
-            </w:r>
-            <w:r>
-              <w:rPr>
-                <w:noProof/>
-                <w:webHidden/>
-              </w:rPr>
               <w:instrText xml:space="preserve"> PAGEREF _Toc241950753 \h </w:instrText>
-            </w:r>
-            <w:r>
-              <w:rPr>
-                <w:noProof/>
-                <w:webHidden/>
-              </w:rPr>
-            </w:r>
-            <w:r>
-              <w:rPr>
-                <w:noProof/>
-                <w:webHidden/>
-              </w:rPr>
               <w:fldChar w:fldCharType="separate"/>
-            </w:r>
-            <w:r>
-              <w:rPr>
-                <w:noProof/>
-                <w:webHidden/>
-              </w:rPr>
               <w:t>16</w:t>
-            </w:r>
-            <w:r>
-              <w:rPr>
-                <w:noProof/>
-                <w:webHidden/>
-              </w:rPr>
               <w:fldChar w:fldCharType="end"/>
             </w:r>
           </w:hyperlink>
@@ -1739,46 +985,10 @@
                 <w:webHidden/>
               </w:rPr>
               <w:tab/>
-            </w:r>
-            <w:r>
-              <w:rPr>
-                <w:noProof/>
-                <w:webHidden/>
-              </w:rPr>
               <w:fldChar w:fldCharType="begin"/>
-            </w:r>
-            <w:r>
-              <w:rPr>
-                <w:noProof/>
-                <w:webHidden/>
-              </w:rPr>
               <w:instrText xml:space="preserve"> PAGEREF _Toc241950754 \h </w:instrText>
-            </w:r>
-            <w:r>
-              <w:rPr>
-                <w:noProof/>
-                <w:webHidden/>
-              </w:rPr>
-            </w:r>
-            <w:r>
-              <w:rPr>
-                <w:noProof/>
-                <w:webHidden/>
-              </w:rPr>
               <w:fldChar w:fldCharType="separate"/>
-            </w:r>
-            <w:r>
-              <w:rPr>
-                <w:noProof/>
-                <w:webHidden/>
-              </w:rPr>
               <w:t>16</w:t>
-            </w:r>
-            <w:r>
-              <w:rPr>
-                <w:noProof/>
-                <w:webHidden/>
-              </w:rPr>
               <w:fldChar w:fldCharType="end"/>
             </w:r>
           </w:hyperlink>
@@ -1810,46 +1020,10 @@
                 <w:webHidden/>
               </w:rPr>
               <w:tab/>
-            </w:r>
-            <w:r>
-              <w:rPr>
-                <w:noProof/>
-                <w:webHidden/>
-              </w:rPr>
               <w:fldChar w:fldCharType="begin"/>
-            </w:r>
-            <w:r>
-              <w:rPr>
-                <w:noProof/>
-                <w:webHidden/>
-              </w:rPr>
               <w:instrText xml:space="preserve"> PAGEREF _Toc241950755 \h </w:instrText>
-            </w:r>
-            <w:r>
-              <w:rPr>
-                <w:noProof/>
-                <w:webHidden/>
-              </w:rPr>
-            </w:r>
-            <w:r>
-              <w:rPr>
-                <w:noProof/>
-                <w:webHidden/>
-              </w:rPr>
               <w:fldChar w:fldCharType="separate"/>
-            </w:r>
-            <w:r>
-              <w:rPr>
-                <w:noProof/>
-                <w:webHidden/>
-              </w:rPr>
               <w:t>16</w:t>
-            </w:r>
-            <w:r>
-              <w:rPr>
-                <w:noProof/>
-                <w:webHidden/>
-              </w:rPr>
               <w:fldChar w:fldCharType="end"/>
             </w:r>
           </w:hyperlink>
@@ -1881,46 +1055,10 @@
                 <w:webHidden/>
               </w:rPr>
               <w:tab/>
-            </w:r>
-            <w:r>
-              <w:rPr>
-                <w:noProof/>
-                <w:webHidden/>
-              </w:rPr>
               <w:fldChar w:fldCharType="begin"/>
-            </w:r>
-            <w:r>
-              <w:rPr>
-                <w:noProof/>
-                <w:webHidden/>
-              </w:rPr>
               <w:instrText xml:space="preserve"> PAGEREF _Toc241950756 \h </w:instrText>
-            </w:r>
-            <w:r>
-              <w:rPr>
-                <w:noProof/>
-                <w:webHidden/>
-              </w:rPr>
-            </w:r>
-            <w:r>
-              <w:rPr>
-                <w:noProof/>
-                <w:webHidden/>
-              </w:rPr>
               <w:fldChar w:fldCharType="separate"/>
-            </w:r>
-            <w:r>
-              <w:rPr>
-                <w:noProof/>
-                <w:webHidden/>
-              </w:rPr>
               <w:t>17</w:t>
-            </w:r>
-            <w:r>
-              <w:rPr>
-                <w:noProof/>
-                <w:webHidden/>
-              </w:rPr>
               <w:fldChar w:fldCharType="end"/>
             </w:r>
           </w:hyperlink>
@@ -1952,46 +1090,10 @@
                 <w:webHidden/>
               </w:rPr>
               <w:tab/>
-            </w:r>
-            <w:r>
-              <w:rPr>
-                <w:noProof/>
-                <w:webHidden/>
-              </w:rPr>
               <w:fldChar w:fldCharType="begin"/>
-            </w:r>
-            <w:r>
-              <w:rPr>
-                <w:noProof/>
-                <w:webHidden/>
-              </w:rPr>
               <w:instrText xml:space="preserve"> PAGEREF _Toc241950757 \h </w:instrText>
-            </w:r>
-            <w:r>
-              <w:rPr>
-                <w:noProof/>
-                <w:webHidden/>
-              </w:rPr>
-            </w:r>
-            <w:r>
-              <w:rPr>
-                <w:noProof/>
-                <w:webHidden/>
-              </w:rPr>
               <w:fldChar w:fldCharType="separate"/>
-            </w:r>
-            <w:r>
-              <w:rPr>
-                <w:noProof/>
-                <w:webHidden/>
-              </w:rPr>
               <w:t>17</w:t>
-            </w:r>
-            <w:r>
-              <w:rPr>
-                <w:noProof/>
-                <w:webHidden/>
-              </w:rPr>
               <w:fldChar w:fldCharType="end"/>
             </w:r>
           </w:hyperlink>
@@ -2023,46 +1125,10 @@
                 <w:webHidden/>
               </w:rPr>
               <w:tab/>
-            </w:r>
-            <w:r>
-              <w:rPr>
-                <w:noProof/>
-                <w:webHidden/>
-              </w:rPr>
               <w:fldChar w:fldCharType="begin"/>
-            </w:r>
-            <w:r>
-              <w:rPr>
-                <w:noProof/>
-                <w:webHidden/>
-              </w:rPr>
               <w:instrText xml:space="preserve"> PAGEREF _Toc241950758 \h </w:instrText>
-            </w:r>
-            <w:r>
-              <w:rPr>
-                <w:noProof/>
-                <w:webHidden/>
-              </w:rPr>
-            </w:r>
-            <w:r>
-              <w:rPr>
-                <w:noProof/>
-                <w:webHidden/>
-              </w:rPr>
               <w:fldChar w:fldCharType="separate"/>
-            </w:r>
-            <w:r>
-              <w:rPr>
-                <w:noProof/>
-                <w:webHidden/>
-              </w:rPr>
               <w:t>18</w:t>
-            </w:r>
-            <w:r>
-              <w:rPr>
-                <w:noProof/>
-                <w:webHidden/>
-              </w:rPr>
               <w:fldChar w:fldCharType="end"/>
             </w:r>
           </w:hyperlink>
@@ -2094,46 +1160,10 @@
                 <w:webHidden/>
               </w:rPr>
               <w:tab/>
-            </w:r>
-            <w:r>
-              <w:rPr>
-                <w:noProof/>
-                <w:webHidden/>
-              </w:rPr>
               <w:fldChar w:fldCharType="begin"/>
-            </w:r>
-            <w:r>
-              <w:rPr>
-                <w:noProof/>
-                <w:webHidden/>
-              </w:rPr>
               <w:instrText xml:space="preserve"> PAGEREF _Toc241950759 \h </w:instrText>
-            </w:r>
-            <w:r>
-              <w:rPr>
-                <w:noProof/>
-                <w:webHidden/>
-              </w:rPr>
-            </w:r>
-            <w:r>
-              <w:rPr>
-                <w:noProof/>
-                <w:webHidden/>
-              </w:rPr>
               <w:fldChar w:fldCharType="separate"/>
-            </w:r>
-            <w:r>
-              <w:rPr>
-                <w:noProof/>
-                <w:webHidden/>
-              </w:rPr>
               <w:t>19</w:t>
-            </w:r>
-            <w:r>
-              <w:rPr>
-                <w:noProof/>
-                <w:webHidden/>
-              </w:rPr>
               <w:fldChar w:fldCharType="end"/>
             </w:r>
           </w:hyperlink>
@@ -2165,46 +1195,10 @@
                 <w:webHidden/>
               </w:rPr>
               <w:tab/>
-            </w:r>
-            <w:r>
-              <w:rPr>
-                <w:noProof/>
-                <w:webHidden/>
-              </w:rPr>
               <w:fldChar w:fldCharType="begin"/>
-            </w:r>
-            <w:r>
-              <w:rPr>
-                <w:noProof/>
-                <w:webHidden/>
-              </w:rPr>
               <w:instrText xml:space="preserve"> PAGEREF _Toc241950760 \h </w:instrText>
-            </w:r>
-            <w:r>
-              <w:rPr>
-                <w:noProof/>
-                <w:webHidden/>
-              </w:rPr>
-            </w:r>
-            <w:r>
-              <w:rPr>
-                <w:noProof/>
-                <w:webHidden/>
-              </w:rPr>
               <w:fldChar w:fldCharType="separate"/>
-            </w:r>
-            <w:r>
-              <w:rPr>
-                <w:noProof/>
-                <w:webHidden/>
-              </w:rPr>
               <w:t>20</w:t>
-            </w:r>
-            <w:r>
-              <w:rPr>
-                <w:noProof/>
-                <w:webHidden/>
-              </w:rPr>
               <w:fldChar w:fldCharType="end"/>
             </w:r>
           </w:hyperlink>
@@ -2236,46 +1230,10 @@
                 <w:webHidden/>
               </w:rPr>
               <w:tab/>
-            </w:r>
-            <w:r>
-              <w:rPr>
-                <w:noProof/>
-                <w:webHidden/>
-              </w:rPr>
               <w:fldChar w:fldCharType="begin"/>
-            </w:r>
-            <w:r>
-              <w:rPr>
-                <w:noProof/>
-                <w:webHidden/>
-              </w:rPr>
               <w:instrText xml:space="preserve"> PAGEREF _Toc241950761 \h </w:instrText>
-            </w:r>
-            <w:r>
-              <w:rPr>
-                <w:noProof/>
-                <w:webHidden/>
-              </w:rPr>
-            </w:r>
-            <w:r>
-              <w:rPr>
-                <w:noProof/>
-                <w:webHidden/>
-              </w:rPr>
               <w:fldChar w:fldCharType="separate"/>
-            </w:r>
-            <w:r>
-              <w:rPr>
-                <w:noProof/>
-                <w:webHidden/>
-              </w:rPr>
               <w:t>22</w:t>
-            </w:r>
-            <w:r>
-              <w:rPr>
-                <w:noProof/>
-                <w:webHidden/>
-              </w:rPr>
               <w:fldChar w:fldCharType="end"/>
             </w:r>
           </w:hyperlink>
@@ -2307,46 +1265,10 @@
                 <w:webHidden/>
               </w:rPr>
               <w:tab/>
-            </w:r>
-            <w:r>
-              <w:rPr>
-                <w:noProof/>
-                <w:webHidden/>
-              </w:rPr>
               <w:fldChar w:fldCharType="begin"/>
-            </w:r>
-            <w:r>
-              <w:rPr>
-                <w:noProof/>
-                <w:webHidden/>
-              </w:rPr>
               <w:instrText xml:space="preserve"> PAGEREF _Toc241950762 \h </w:instrText>
-            </w:r>
-            <w:r>
-              <w:rPr>
-                <w:noProof/>
-                <w:webHidden/>
-              </w:rPr>
-            </w:r>
-            <w:r>
-              <w:rPr>
-                <w:noProof/>
-                <w:webHidden/>
-              </w:rPr>
               <w:fldChar w:fldCharType="separate"/>
-            </w:r>
-            <w:r>
-              <w:rPr>
-                <w:noProof/>
-                <w:webHidden/>
-              </w:rPr>
               <w:t>23</w:t>
-            </w:r>
-            <w:r>
-              <w:rPr>
-                <w:noProof/>
-                <w:webHidden/>
-              </w:rPr>
               <w:fldChar w:fldCharType="end"/>
             </w:r>
           </w:hyperlink>
@@ -2378,46 +1300,10 @@
                 <w:webHidden/>
               </w:rPr>
               <w:tab/>
-            </w:r>
-            <w:r>
-              <w:rPr>
-                <w:noProof/>
-                <w:webHidden/>
-              </w:rPr>
               <w:fldChar w:fldCharType="begin"/>
-            </w:r>
-            <w:r>
-              <w:rPr>
-                <w:noProof/>
-                <w:webHidden/>
-              </w:rPr>
               <w:instrText xml:space="preserve"> PAGEREF _Toc241950763 \h </w:instrText>
-            </w:r>
-            <w:r>
-              <w:rPr>
-                <w:noProof/>
-                <w:webHidden/>
-              </w:rPr>
-            </w:r>
-            <w:r>
-              <w:rPr>
-                <w:noProof/>
-                <w:webHidden/>
-              </w:rPr>
               <w:fldChar w:fldCharType="separate"/>
-            </w:r>
-            <w:r>
-              <w:rPr>
-                <w:noProof/>
-                <w:webHidden/>
-              </w:rPr>
               <w:t>24</w:t>
-            </w:r>
-            <w:r>
-              <w:rPr>
-                <w:noProof/>
-                <w:webHidden/>
-              </w:rPr>
               <w:fldChar w:fldCharType="end"/>
             </w:r>
           </w:hyperlink>
@@ -2449,46 +1335,10 @@
                 <w:webHidden/>
               </w:rPr>
               <w:tab/>
-            </w:r>
-            <w:r>
-              <w:rPr>
-                <w:noProof/>
-                <w:webHidden/>
-              </w:rPr>
               <w:fldChar w:fldCharType="begin"/>
-            </w:r>
-            <w:r>
-              <w:rPr>
-                <w:noProof/>
-                <w:webHidden/>
-              </w:rPr>
               <w:instrText xml:space="preserve"> PAGEREF _Toc241950764 \h </w:instrText>
-            </w:r>
-            <w:r>
-              <w:rPr>
-                <w:noProof/>
-                <w:webHidden/>
-              </w:rPr>
-            </w:r>
-            <w:r>
-              <w:rPr>
-                <w:noProof/>
-                <w:webHidden/>
-              </w:rPr>
               <w:fldChar w:fldCharType="separate"/>
-            </w:r>
-            <w:r>
-              <w:rPr>
-                <w:noProof/>
-                <w:webHidden/>
-              </w:rPr>
               <w:t>24</w:t>
-            </w:r>
-            <w:r>
-              <w:rPr>
-                <w:noProof/>
-                <w:webHidden/>
-              </w:rPr>
               <w:fldChar w:fldCharType="end"/>
             </w:r>
           </w:hyperlink>
@@ -2520,46 +1370,10 @@
                 <w:webHidden/>
               </w:rPr>
               <w:tab/>
-            </w:r>
-            <w:r>
-              <w:rPr>
-                <w:noProof/>
-                <w:webHidden/>
-              </w:rPr>
               <w:fldChar w:fldCharType="begin"/>
-            </w:r>
-            <w:r>
-              <w:rPr>
-                <w:noProof/>
-                <w:webHidden/>
-              </w:rPr>
               <w:instrText xml:space="preserve"> PAGEREF _Toc241950765 \h </w:instrText>
-            </w:r>
-            <w:r>
-              <w:rPr>
-                <w:noProof/>
-                <w:webHidden/>
-              </w:rPr>
-            </w:r>
-            <w:r>
-              <w:rPr>
-                <w:noProof/>
-                <w:webHidden/>
-              </w:rPr>
               <w:fldChar w:fldCharType="separate"/>
-            </w:r>
-            <w:r>
-              <w:rPr>
-                <w:noProof/>
-                <w:webHidden/>
-              </w:rPr>
               <w:t>25</w:t>
-            </w:r>
-            <w:r>
-              <w:rPr>
-                <w:noProof/>
-                <w:webHidden/>
-              </w:rPr>
               <w:fldChar w:fldCharType="end"/>
             </w:r>
           </w:hyperlink>
@@ -2591,46 +1405,10 @@
                 <w:webHidden/>
               </w:rPr>
               <w:tab/>
-            </w:r>
-            <w:r>
-              <w:rPr>
-                <w:noProof/>
-                <w:webHidden/>
-              </w:rPr>
               <w:fldChar w:fldCharType="begin"/>
-            </w:r>
-            <w:r>
-              <w:rPr>
-                <w:noProof/>
-                <w:webHidden/>
-              </w:rPr>
               <w:instrText xml:space="preserve"> PAGEREF _Toc241950766 \h </w:instrText>
-            </w:r>
-            <w:r>
-              <w:rPr>
-                <w:noProof/>
-                <w:webHidden/>
-              </w:rPr>
-            </w:r>
-            <w:r>
-              <w:rPr>
-                <w:noProof/>
-                <w:webHidden/>
-              </w:rPr>
               <w:fldChar w:fldCharType="separate"/>
-            </w:r>
-            <w:r>
-              <w:rPr>
-                <w:noProof/>
-                <w:webHidden/>
-              </w:rPr>
               <w:t>25</w:t>
-            </w:r>
-            <w:r>
-              <w:rPr>
-                <w:noProof/>
-                <w:webHidden/>
-              </w:rPr>
               <w:fldChar w:fldCharType="end"/>
             </w:r>
           </w:hyperlink>
@@ -3820,15 +2598,7 @@
           <w:sz w:val="22"/>
           <w:szCs w:val="22"/>
         </w:rPr>
-        <w:t>Los requisitos no funcionales con mayor impacto en la arquitectura son el desempeño del reconocimiento de gestos (RNF-05 y RNF-06: al menos 15 cuadros por segundo y una respuesta menor o igual a 200 ms), el bajo consumo de recursos (RNF-08), la privacidad de la información de teclado, cámara y micrófono (RNF-16 y RNF-17), la seguridad de las cuentas y de la API (RNF-10 a RNF-15), la estabilidad durante una jornada de 8 horas (RNF-21) y la mantenibilidad del código (RNF-27 a RNF-29). La sección 13 detalla la</w:t>
-      </w:r>
-      <w:r>
-        <w:rPr>
-          <w:rFonts w:ascii="Calibri" w:hAnsi="Calibri" w:cs="Calibri"/>
-          <w:sz w:val="22"/>
-          <w:szCs w:val="22"/>
-        </w:rPr>
-        <w:t xml:space="preserve"> estrategia con que la arquitectura aborda cada uno de ellos.</w:t>
+        <w:t xml:space="preserve">Los requisitos no funcionales con mayor impacto en la arquitectura son el desempeño del reconocimiento de gestos (RNF-05 y RNF-06: al menos 15 cuadros por segundo y una respuesta menor o igual a 200 ms), el bajo consumo de recursos (RNF-08), la privacidad de la información de teclado, cámara y micrófono (RNF-16 y RNF-17), la seguridad de las cuentas y de la API (RNF-10 a RNF-15), la estabilidad durante una jornada de 8 horas (RNF-21) y la mantenibilidad del código (RNF-27 a RNF-29). La sección 13 detalla la estrategia con que la arquitectura aborda cada uno de ellos.</w:t>
       </w:r>
     </w:p>
     <w:p>
@@ -3999,7 +2769,7 @@
           <w:sz w:val="22"/>
           <w:szCs w:val="22"/>
         </w:rPr>
-        <w:t>El equipo está formado por dos integrantes y el desarrollo se organiza en seis Sprints, por lo que se privilegian tecnologías gratuitas, conocidas por el equipo y con documentación abundante.</w:t>
+        <w:t xml:space="preserve">El equipo está formado por dos integrantes y el desarrollo se organiza en seis Sprints, por lo que se privilegian tecnologías conocidas por el equipo y con documentación abundante. Además, el proyecto no cuenta con presupuesto, por lo que todas las tecnologías y servicios utilizados deben ser gratuitos.</w:t>
       </w:r>
     </w:p>
     <w:p>
@@ -5766,15 +4536,7 @@
           <w:sz w:val="22"/>
           <w:szCs w:val="22"/>
         </w:rPr>
-        <w:t>Para los gestos se utiliza MediaPipe Hands, que obtiene 21 puntos de referencia de la mano en tiempo real utilizando solo el procesador (Zhang et al., 2020). Los gestos se clasifican mediante reglas geométricas sobre esos puntos (por ejemplo, la distancia entre las puntas del índice y del pulgar), por lo que no es necesario entrenar un modelo propio. La cámara solo se abre mientras el control por gestos está activado y, si no existe una cámara disponible, el módulo lo informa sin afectar al resto de la apli</w:t>
-      </w:r>
-      <w:r>
-        <w:rPr>
-          <w:rFonts w:ascii="Calibri" w:hAnsi="Calibri" w:cs="Calibri"/>
-          <w:sz w:val="22"/>
-          <w:szCs w:val="22"/>
-        </w:rPr>
-        <w:t>cación (PB-07).</w:t>
+        <w:t>Para los gestos se utiliza MediaPipe Hands, que obtiene 21 puntos de referencia de la mano en tiempo real utilizando solo el procesador (Zhang et al., 2020). Los gestos se clasifican mediante reglas geométricas sobre esos puntos (por ejemplo, la distancia entre las puntas del índice y del pulgar), por lo que no es necesario entrenar un modelo propio. La cámara solo se abre mientras el control por gestos está activado y, si no existe una cámara disponible, el módulo lo informa sin afectar al resto de la aplicación (PB-07).</w:t>
       </w:r>
     </w:p>
     <w:p>
@@ -6242,15 +5004,7 @@
           <w:sz w:val="22"/>
           <w:szCs w:val="22"/>
         </w:rPr>
-        <w:t>Para que el control por voz pueda volver a activarse mediante la voz, el micrófono no se cierra al desactivarlo: el reconocedor pasa a un modo de espera en el que su gramática contiene solo los comandos «activar gestos», «activar voz» y «activar gestos y voz», y cualquier otra expresión se descarta. Mientras está en este modo no se reconocen comandos base ni frases de macros, y la interfaz muestra que el micrófono se encuentra en espera (PB-17). La cámara, en cambio, solo se abre mientras el control por ges</w:t>
-      </w:r>
-      <w:r>
-        <w:rPr>
-          <w:rFonts w:ascii="Calibri" w:hAnsi="Calibri" w:cs="Calibri"/>
-          <w:sz w:val="22"/>
-          <w:szCs w:val="22"/>
-        </w:rPr>
-        <w:t>tos está activado.</w:t>
+        <w:t>Para que el control por voz pueda volver a activarse mediante la voz, el micrófono no se cierra al desactivarlo: el reconocedor pasa a un modo de espera en el que su gramática contiene solo los comandos «activar gestos», «activar voz» y «activar gestos y voz», y cualquier otra expresión se descarta. Mientras está en este modo no se reconocen comandos base ni frases de macros, y la interfaz muestra que el micrófono se encuentra en espera (PB-17). La cámara, en cambio, solo se abre mientras el control por gestos está activado.</w:t>
       </w:r>
     </w:p>
     <w:p>
@@ -7508,15 +6262,7 @@
           <w:sz w:val="22"/>
           <w:szCs w:val="22"/>
         </w:rPr>
-        <w:t>El movimiento continuo del cursor lo aplica directamente el hilo de gestos, sin pasar por la cola del ejecutor ni por el hilo de la interfaz, para cumplir el tiempo de respuesta de RNF-06. Al cerrar la aplicación, el controlador detiene los hilos en orden inverso a su creación, libera la cámara y el micrófono, registra el término de la pausa y de la sesión de uso abiertas e intenta enviar los registros pendientes. Este ciclo de vida controlado evita la acumulación de recursos durante el uso prolongado (RNF-</w:t>
-      </w:r>
-      <w:r>
-        <w:rPr>
-          <w:rFonts w:ascii="Calibri" w:hAnsi="Calibri" w:cs="Calibri"/>
-          <w:sz w:val="22"/>
-          <w:szCs w:val="22"/>
-        </w:rPr>
-        <w:t>21).</w:t>
+        <w:t>El movimiento continuo del cursor lo aplica directamente el hilo de gestos, sin pasar por la cola del ejecutor ni por el hilo de la interfaz, para cumplir el tiempo de respuesta de RNF-06. Al cerrar la aplicación, el controlador detiene los hilos en orden inverso a su creación, libera la cámara y el micrófono, registra el término de la pausa y de la sesión de uso abiertas e intenta enviar los registros pendientes. Este ciclo de vida controlado evita la acumulación de recursos durante el uso prolongado (RNF-21).</w:t>
       </w:r>
     </w:p>
     <w:p>
@@ -10916,7 +9662,7 @@
                 <w:sz w:val="22"/>
                 <w:szCs w:val="22"/>
               </w:rPr>
-              <w:t>Cifrado en tránsito</w:t>
+              <w:t xml:space="preserve">Cifrado en tránsito</w:t>
             </w:r>
           </w:p>
         </w:tc>
@@ -10939,7 +9685,7 @@
                 <w:sz w:val="22"/>
                 <w:szCs w:val="22"/>
               </w:rPr>
-              <w:t>Caddy termina TLS y solo expone HTTPS; en el entorno de desarrollo local se permite HTTP.</w:t>
+              <w:t xml:space="preserve">Tailscale Funnel publica la API solo mediante HTTPS, con un certificado válido que se emite y renueva automáticamente; en el entorno de desarrollo local se permite HTTP.</w:t>
             </w:r>
           </w:p>
         </w:tc>
@@ -10962,7 +9708,7 @@
                 <w:sz w:val="22"/>
                 <w:szCs w:val="22"/>
               </w:rPr>
-              <w:t>RNF-11</w:t>
+              <w:t xml:space="preserve">RNF-11</w:t>
             </w:r>
           </w:p>
         </w:tc>
@@ -11286,7 +10032,7 @@
                 <w:sz w:val="22"/>
                 <w:szCs w:val="22"/>
               </w:rPr>
-              <w:t>Secretos del servidor</w:t>
+              <w:t xml:space="preserve">Secretos del servidor</w:t>
             </w:r>
           </w:p>
         </w:tc>
@@ -11309,7 +10055,7 @@
                 <w:sz w:val="22"/>
                 <w:szCs w:val="22"/>
               </w:rPr>
-              <w:t>La contraseña de la base de datos y la clave de firma de tokens se leen desde variables de entorno; el repositorio solo contiene .env.example.</w:t>
+              <w:t xml:space="preserve">La contraseña de la base de datos, la clave de firma de tokens y la clave de autenticación de Tailscale se leen desde variables de entorno; el repositorio solo contiene .env.example.</w:t>
             </w:r>
           </w:p>
         </w:tc>
@@ -11332,7 +10078,7 @@
                 <w:sz w:val="22"/>
                 <w:szCs w:val="22"/>
               </w:rPr>
-              <w:t>RNF-15, RNF-30</w:t>
+              <w:t xml:space="preserve">RNF-15, RNF-30</w:t>
             </w:r>
           </w:p>
         </w:tc>
@@ -11687,6 +10433,24 @@
           <w:szCs w:val="22"/>
         </w:rPr>
         <w:t>La Figura 8 muestra la distribución de los componentes en tiempo de ejecución. La aplicación se distribuye como un ejecutable generado con PyInstaller, que incluye el intérprete de Python, las librerías y los modelos de MediaPipe y Vosk, por lo que no requiere instalar herramientas de desarrollo (RNF-26). El servidor se levanta con un único comando de Docker Compose (Docker Inc., s. f.), según RNF-25.</w:t>
+      </w:r>
+    </w:p>
+    <w:p>
+      <w:pPr>
+        <w:jc w:val="both"/>
+        <w:rPr>
+          <w:rFonts w:ascii="Calibri" w:hAnsi="Calibri" w:cs="Calibri"/>
+          <w:sz w:val="22"/>
+          <w:szCs w:val="22"/>
+        </w:rPr>
+      </w:pPr>
+      <w:r>
+        <w:rPr>
+          <w:rFonts w:ascii="Calibri" w:hAnsi="Calibri" w:cs="Calibri"/>
+          <w:sz w:val="22"/>
+          <w:szCs w:val="22"/>
+        </w:rPr>
+        <w:t xml:space="preserve">Para cumplir RNF-11 sin costo, el servidor se publica en internet mediante Tailscale Funnel (Tailscale Inc., s. f.), incluido en el plan Personal gratuito de Tailscale. El servicio tailscale de Docker Compose recibe las conexiones HTTPS en una dirección fija del dominio ts.net, gestiona automáticamente el certificado y las reenvía a la API por la red interna, por lo que no se requiere contratar un dominio, disponer de una IP pública ni abrir puertos en el router. Como consecuencia, el servidor solo está disponible mientras el computador que lo ejecuta permanece encendido, condición suficiente para las pruebas del Sprint 06 y la presentación. Si se requiriera disponibilidad permanente, el mismo archivo docker-compose.yml puede ejecutarse en una máquina virtual obtenida con Azure for Students, sin cambios en la aplicación.</w:t>
       </w:r>
     </w:p>
     <w:p>
@@ -11960,7 +10724,7 @@
                 <w:sz w:val="22"/>
                 <w:szCs w:val="22"/>
               </w:rPr>
-              <w:t>Pruebas</w:t>
+              <w:t xml:space="preserve">Pruebas</w:t>
             </w:r>
           </w:p>
         </w:tc>
@@ -11983,7 +10747,7 @@
                 <w:sz w:val="22"/>
                 <w:szCs w:val="22"/>
               </w:rPr>
-              <w:t>Servidor completo en un equipo distinto al de desarrollo; aplicación empaquetada en dos computadores.</w:t>
+              <w:t xml:space="preserve">Servidor completo en un equipo distinto al de desarrollo, publicado mediante Tailscale Funnel; aplicación empaquetada en dos computadores.</w:t>
             </w:r>
           </w:p>
         </w:tc>
@@ -12006,7 +10770,7 @@
                 <w:sz w:val="22"/>
                 <w:szCs w:val="22"/>
               </w:rPr>
-              <w:t>Pruebas del Sprint 06: acceso desde dos computadores, pérdida de conexión y despliegue (SB06-T24 a SB06-T27).</w:t>
+              <w:t xml:space="preserve">Pruebas del Sprint 06: acceso desde dos computadores, pérdida de conexión y despliegue (SB06-T24 a SB06-T27).</w:t>
             </w:r>
           </w:p>
         </w:tc>
@@ -12034,7 +10798,7 @@
                 <w:sz w:val="22"/>
                 <w:szCs w:val="22"/>
               </w:rPr>
-              <w:t>Presentación</w:t>
+              <w:t xml:space="preserve">Presentación</w:t>
             </w:r>
           </w:p>
         </w:tc>
@@ -12057,7 +10821,7 @@
                 <w:sz w:val="22"/>
                 <w:szCs w:val="22"/>
               </w:rPr>
-              <w:t>Servidor completo con HTTPS y aplicación empaquetada.</w:t>
+              <w:t xml:space="preserve">Servidor completo en Docker en el computador de uno de los integrantes, publicado con HTTPS mediante Tailscale Funnel en una dirección fija, y aplicación empaquetada.</w:t>
             </w:r>
           </w:p>
         </w:tc>
@@ -12080,7 +10844,7 @@
                 <w:sz w:val="22"/>
                 <w:szCs w:val="22"/>
               </w:rPr>
-              <w:t>Demostración del MVP.</w:t>
+              <w:t xml:space="preserve">Demostración del MVP.</w:t>
             </w:r>
           </w:p>
         </w:tc>
@@ -13325,7 +12089,7 @@
                 <w:sz w:val="22"/>
                 <w:szCs w:val="22"/>
               </w:rPr>
-              <w:t>Proxy inverso</w:t>
+              <w:t xml:space="preserve">Publicación y HTTPS</w:t>
             </w:r>
           </w:p>
         </w:tc>
@@ -13348,7 +12112,7 @@
                 <w:sz w:val="22"/>
                 <w:szCs w:val="22"/>
               </w:rPr>
-              <w:t>Caddy 2</w:t>
+              <w:t xml:space="preserve">Tailscale Funnel</w:t>
             </w:r>
           </w:p>
         </w:tc>
@@ -13371,7 +12135,7 @@
                 <w:sz w:val="22"/>
                 <w:szCs w:val="22"/>
               </w:rPr>
-              <w:t>HTTPS y reenvío de solicitudes a la API.</w:t>
+              <w:t xml:space="preserve">Dirección pública fija con HTTPS y reenvío de solicitudes a la API, sin costo.</w:t>
             </w:r>
           </w:p>
         </w:tc>
@@ -14708,7 +13472,7 @@
                 <w:sz w:val="22"/>
                 <w:szCs w:val="22"/>
               </w:rPr>
-              <w:t>DA-11</w:t>
+              <w:t xml:space="preserve">DA-11</w:t>
             </w:r>
           </w:p>
         </w:tc>
@@ -14731,7 +13495,7 @@
                 <w:sz w:val="22"/>
                 <w:szCs w:val="22"/>
               </w:rPr>
-              <w:t>Caddy como proxy inverso.</w:t>
+              <w:t xml:space="preserve">Publicación del servidor mediante Tailscale Funnel.</w:t>
             </w:r>
           </w:p>
         </w:tc>
@@ -14754,7 +13518,7 @@
                 <w:sz w:val="22"/>
                 <w:szCs w:val="22"/>
               </w:rPr>
-              <w:t>Nginx; exponer Uvicorn directamente.</w:t>
+              <w:t xml:space="preserve">Caddy o Nginx con un dominio propio; túnel rápido de Cloudflare; hosting gratuito en la nube.</w:t>
             </w:r>
           </w:p>
         </w:tc>
@@ -14777,7 +13541,7 @@
                 <w:sz w:val="22"/>
                 <w:szCs w:val="22"/>
               </w:rPr>
-              <w:t>Configuración mínima y certificados TLS automáticos para cumplir RNF-11.</w:t>
+              <w:t xml:space="preserve">Entrega HTTPS con certificado automático y una dirección fija sin costo, sin contratar un dominio ni abrir puertos (RNF-11). Caddy o Nginx requieren un dominio pagado y puertos accesibles desde internet; el túnel rápido de Cloudflare cambia de dirección en cada reinicio, y los planes gratuitos de hosting imponen límites como la eliminación de la base de datos gratuita después de 30 días.</w:t>
             </w:r>
           </w:p>
         </w:tc>
@@ -16062,7 +14826,7 @@
                 <w:sz w:val="22"/>
                 <w:szCs w:val="22"/>
               </w:rPr>
-              <w:t>docker-compose.yml, Caddyfile y .env.example</w:t>
+              <w:t xml:space="preserve">docker-compose.yml y .env.example</w:t>
             </w:r>
           </w:p>
         </w:tc>
@@ -16085,7 +14849,7 @@
                 <w:sz w:val="22"/>
                 <w:szCs w:val="22"/>
               </w:rPr>
-              <w:t>Servicios de Docker Compose, configuración del proxy inverso y variables de entorno documentadas.</w:t>
+              <w:t xml:space="preserve">Servicios de Docker Compose (api, db, backup y tailscale) y variables de entorno documentadas, incluida la clave de autenticación de Tailscale.</w:t>
             </w:r>
           </w:p>
         </w:tc>
@@ -18978,6 +17742,80 @@
           </w:p>
         </w:tc>
       </w:tr>
+      <w:tr>
+        <w:trPr>
+          <w:cantSplit/>
+        </w:trPr>
+        <w:tc>
+          <w:tcPr>
+            <w:tcW w:w="3000" w:type="dxa"/>
+          </w:tcPr>
+          <w:p>
+            <w:pPr>
+              <w:spacing w:after="40"/>
+              <w:rPr>
+                <w:rFonts w:ascii="Calibri" w:hAnsi="Calibri" w:cs="Calibri"/>
+                <w:sz w:val="22"/>
+                <w:szCs w:val="22"/>
+              </w:rPr>
+            </w:pPr>
+            <w:r>
+              <w:rPr>
+                <w:rFonts w:ascii="Calibri" w:hAnsi="Calibri" w:cs="Calibri"/>
+                <w:sz w:val="22"/>
+                <w:szCs w:val="22"/>
+              </w:rPr>
+              <w:t xml:space="preserve">El computador que ejecuta el servidor está apagado o sin conexión durante las pruebas o la presentación.</w:t>
+            </w:r>
+          </w:p>
+        </w:tc>
+        <w:tc>
+          <w:tcPr>
+            <w:tcW w:w="1900" w:type="dxa"/>
+          </w:tcPr>
+          <w:p>
+            <w:pPr>
+              <w:spacing w:after="40"/>
+              <w:rPr>
+                <w:rFonts w:ascii="Calibri" w:hAnsi="Calibri" w:cs="Calibri"/>
+                <w:sz w:val="22"/>
+                <w:szCs w:val="22"/>
+              </w:rPr>
+            </w:pPr>
+            <w:r>
+              <w:rPr>
+                <w:rFonts w:ascii="Calibri" w:hAnsi="Calibri" w:cs="Calibri"/>
+                <w:sz w:val="22"/>
+                <w:szCs w:val="22"/>
+              </w:rPr>
+              <w:t xml:space="preserve">El servidor no está disponible para la aplicación.</w:t>
+            </w:r>
+          </w:p>
+        </w:tc>
+        <w:tc>
+          <w:tcPr>
+            <w:tcW w:w="3938" w:type="dxa"/>
+          </w:tcPr>
+          <w:p>
+            <w:pPr>
+              <w:spacing w:after="40"/>
+              <w:rPr>
+                <w:rFonts w:ascii="Calibri" w:hAnsi="Calibri" w:cs="Calibri"/>
+                <w:sz w:val="22"/>
+                <w:szCs w:val="22"/>
+              </w:rPr>
+            </w:pPr>
+            <w:r>
+              <w:rPr>
+                <w:rFonts w:ascii="Calibri" w:hAnsi="Calibri" w:cs="Calibri"/>
+                <w:sz w:val="22"/>
+                <w:szCs w:val="22"/>
+              </w:rPr>
+              <w:t xml:space="preserve">Verificar el servidor y su dirección de Tailscale antes de cada prueba y de la presentación; si se requiere disponibilidad permanente, ejecutar el mismo docker-compose.yml en Azure for Students.</w:t>
+            </w:r>
+          </w:p>
+        </w:tc>
+      </w:tr>
     </w:tbl>
     <w:p>
       <w:pPr>
@@ -19266,6 +18104,103 @@
           </w:p>
         </w:tc>
       </w:tr>
+      <w:tr>
+        <w:trPr>
+          <w:cantSplit/>
+        </w:trPr>
+        <w:tc>
+          <w:tcPr>
+            <w:tcW w:w="1100" w:type="dxa"/>
+          </w:tcPr>
+          <w:p>
+            <w:pPr>
+              <w:spacing w:after="40"/>
+              <w:rPr>
+                <w:rFonts w:ascii="Calibri" w:hAnsi="Calibri" w:cs="Calibri"/>
+                <w:sz w:val="22"/>
+                <w:szCs w:val="22"/>
+              </w:rPr>
+            </w:pPr>
+            <w:r>
+              <w:rPr>
+                <w:rFonts w:ascii="Calibri" w:hAnsi="Calibri" w:cs="Calibri"/>
+                <w:sz w:val="22"/>
+                <w:szCs w:val="22"/>
+              </w:rPr>
+              <w:t xml:space="preserve">1.1</w:t>
+            </w:r>
+          </w:p>
+        </w:tc>
+        <w:tc>
+          <w:tcPr>
+            <w:tcW w:w="1500" w:type="dxa"/>
+          </w:tcPr>
+          <w:p>
+            <w:pPr>
+              <w:spacing w:after="40"/>
+              <w:rPr>
+                <w:rFonts w:ascii="Calibri" w:hAnsi="Calibri" w:cs="Calibri"/>
+                <w:sz w:val="22"/>
+                <w:szCs w:val="22"/>
+              </w:rPr>
+            </w:pPr>
+            <w:r>
+              <w:rPr>
+                <w:rFonts w:ascii="Calibri" w:hAnsi="Calibri" w:cs="Calibri"/>
+                <w:sz w:val="22"/>
+                <w:szCs w:val="22"/>
+              </w:rPr>
+              <w:t xml:space="preserve">05-10-2026</w:t>
+            </w:r>
+          </w:p>
+        </w:tc>
+        <w:tc>
+          <w:tcPr>
+            <w:tcW w:w="3938" w:type="dxa"/>
+          </w:tcPr>
+          <w:p>
+            <w:pPr>
+              <w:spacing w:after="40"/>
+              <w:rPr>
+                <w:rFonts w:ascii="Calibri" w:hAnsi="Calibri" w:cs="Calibri"/>
+                <w:sz w:val="22"/>
+                <w:szCs w:val="22"/>
+              </w:rPr>
+            </w:pPr>
+            <w:r>
+              <w:rPr>
+                <w:rFonts w:ascii="Calibri" w:hAnsi="Calibri" w:cs="Calibri"/>
+                <w:sz w:val="22"/>
+                <w:szCs w:val="22"/>
+              </w:rPr>
+              <w:t xml:space="preserve">Se reemplaza Caddy por Tailscale Funnel para publicar el servidor con HTTPS sin costo (DA-11, secciones 8 a 10 y Figuras 1, 5 y 8).</w:t>
+            </w:r>
+          </w:p>
+        </w:tc>
+        <w:tc>
+          <w:tcPr>
+            <w:tcW w:w="2300" w:type="dxa"/>
+          </w:tcPr>
+          <w:p>
+            <w:pPr>
+              <w:spacing w:after="40"/>
+              <w:rPr>
+                <w:rFonts w:ascii="Calibri" w:hAnsi="Calibri" w:cs="Calibri"/>
+                <w:sz w:val="22"/>
+                <w:szCs w:val="22"/>
+              </w:rPr>
+            </w:pPr>
+            <w:r>
+              <w:rPr>
+                <w:rFonts w:ascii="Calibri" w:hAnsi="Calibri" w:cs="Calibri"/>
+                <w:sz w:val="22"/>
+                <w:szCs w:val="22"/>
+              </w:rPr>
+              <w:t xml:space="preserve">Alejandro Silva y Bastian Pino</w:t>
+            </w:r>
+          </w:p>
+        </w:tc>
+      </w:tr>
     </w:tbl>
     <w:p>
       <w:pPr>
@@ -19554,6 +18489,42 @@
           <w:szCs w:val="22"/>
         </w:rPr>
         <w:t>. Recuperado el 3 de octubre de 2026, de https://fastapi.tiangolo.com/</w:t>
+      </w:r>
+    </w:p>
+    <w:p>
+      <w:pPr>
+        <w:ind w:left="720" w:hanging="720"/>
+        <w:rPr>
+          <w:rFonts w:ascii="Calibri" w:hAnsi="Calibri" w:cs="Calibri"/>
+          <w:sz w:val="22"/>
+          <w:szCs w:val="22"/>
+        </w:rPr>
+      </w:pPr>
+      <w:r>
+        <w:rPr>
+          <w:rFonts w:ascii="Calibri" w:hAnsi="Calibri" w:cs="Calibri"/>
+          <w:sz w:val="22"/>
+          <w:szCs w:val="22"/>
+        </w:rPr>
+        <w:t xml:space="preserve">Tailscale Inc. (s. f.). </w:t>
+      </w:r>
+      <w:r>
+        <w:rPr>
+          <w:rFonts w:ascii="Calibri" w:hAnsi="Calibri" w:cs="Calibri"/>
+          <w:i/>
+          <w:iCs/>
+          <w:sz w:val="22"/>
+          <w:szCs w:val="22"/>
+        </w:rPr>
+        <w:t xml:space="preserve">Tailscale Funnel</w:t>
+      </w:r>
+      <w:r>
+        <w:rPr>
+          <w:rFonts w:ascii="Calibri" w:hAnsi="Calibri" w:cs="Calibri"/>
+          <w:sz w:val="22"/>
+          <w:szCs w:val="22"/>
+        </w:rPr>
+        <w:t xml:space="preserve">. Recuperado el 5 de octubre de 2026, de https://tailscale.com/docs/features/tailscale-funnel</w:t>
       </w:r>
     </w:p>
     <w:p>

</xml_diff>

<commit_message>
docs: Se actualiza cierre del Sprint 01 y planificación del Sprint 02
</commit_message>
<xml_diff>
--- a/FASE 2/Evidencias Proyecto/Documentacion/Documento de arquitectura.docx
+++ b/FASE 2/Evidencias Proyecto/Documentacion/Documento de arquitectura.docx
@@ -4265,7 +4265,7 @@
           <w:sz w:val="22"/>
           <w:szCs w:val="22"/>
         </w:rPr>
-        <w:t>El módulo de monitoreo registra únicamente el instante de la última interacción de teclado o mouse, sin almacenar qué tecla se presionó ni el texto escrito (RNF-16). A partir de ese instante, un temporizador evaluado cada segundo controla dos mecanismos independientes, representados en la Figura 3:</w:t>
+        <w:t>El módulo de monitoreo registra únicamente el instante de la última interacción de teclado o mouse, es decir, una pulsación de tecla, un click, un desplazamiento con la rueda o un movimiento del cursor, sin almacenar qué tecla se presionó, la posición del cursor ni el texto escrito (RNF-16). A partir de ese instante, un temporizador evaluado cada segundo controla dos mecanismos independientes, representados en la Figura 3:</w:t>
       </w:r>
     </w:p>
     <w:p>
@@ -5912,7 +5912,7 @@
                 <w:sz w:val="22"/>
                 <w:szCs w:val="22"/>
               </w:rPr>
-              <w:t>Listeners de pynput, que solo actualizan la marca de tiempo de la última actividad.</w:t>
+              <w:t>Listeners de pynput para teclas, clicks, rueda y movimiento del mouse, que solo actualizan la marca de tiempo de la última actividad.</w:t>
             </w:r>
           </w:p>
         </w:tc>
@@ -18174,6 +18174,103 @@
                 <w:szCs w:val="22"/>
               </w:rPr>
               <w:t xml:space="preserve">Se reemplaza Caddy por Tailscale Funnel para publicar el servidor con HTTPS sin costo (DA-11, secciones 8 a 10 y Figuras 1, 5 y 8).</w:t>
+            </w:r>
+          </w:p>
+        </w:tc>
+        <w:tc>
+          <w:tcPr>
+            <w:tcW w:w="2300" w:type="dxa"/>
+          </w:tcPr>
+          <w:p>
+            <w:pPr>
+              <w:spacing w:after="40"/>
+              <w:rPr>
+                <w:rFonts w:ascii="Calibri" w:hAnsi="Calibri" w:cs="Calibri"/>
+                <w:sz w:val="22"/>
+                <w:szCs w:val="22"/>
+              </w:rPr>
+            </w:pPr>
+            <w:r>
+              <w:rPr>
+                <w:rFonts w:ascii="Calibri" w:hAnsi="Calibri" w:cs="Calibri"/>
+                <w:sz w:val="22"/>
+                <w:szCs w:val="22"/>
+              </w:rPr>
+              <w:t xml:space="preserve">Alejandro Silva y Bastian Pino</w:t>
+            </w:r>
+          </w:p>
+        </w:tc>
+      </w:tr>
+      <w:tr>
+        <w:trPr>
+          <w:cantSplit/>
+        </w:trPr>
+        <w:tc>
+          <w:tcPr>
+            <w:tcW w:w="1100" w:type="dxa"/>
+          </w:tcPr>
+          <w:p>
+            <w:pPr>
+              <w:spacing w:after="40"/>
+              <w:rPr>
+                <w:rFonts w:ascii="Calibri" w:hAnsi="Calibri" w:cs="Calibri"/>
+                <w:sz w:val="22"/>
+                <w:szCs w:val="22"/>
+              </w:rPr>
+            </w:pPr>
+            <w:r>
+              <w:rPr>
+                <w:rFonts w:ascii="Calibri" w:hAnsi="Calibri" w:cs="Calibri"/>
+                <w:sz w:val="22"/>
+                <w:szCs w:val="22"/>
+              </w:rPr>
+              <w:t xml:space="preserve">1.2</w:t>
+            </w:r>
+          </w:p>
+        </w:tc>
+        <w:tc>
+          <w:tcPr>
+            <w:tcW w:w="1500" w:type="dxa"/>
+          </w:tcPr>
+          <w:p>
+            <w:pPr>
+              <w:spacing w:after="40"/>
+              <w:rPr>
+                <w:rFonts w:ascii="Calibri" w:hAnsi="Calibri" w:cs="Calibri"/>
+                <w:sz w:val="22"/>
+                <w:szCs w:val="22"/>
+              </w:rPr>
+            </w:pPr>
+            <w:r>
+              <w:rPr>
+                <w:rFonts w:ascii="Calibri" w:hAnsi="Calibri" w:cs="Calibri"/>
+                <w:sz w:val="22"/>
+                <w:szCs w:val="22"/>
+              </w:rPr>
+              <w:t xml:space="preserve">11-10-2026</w:t>
+            </w:r>
+          </w:p>
+        </w:tc>
+        <w:tc>
+          <w:tcPr>
+            <w:tcW w:w="3938" w:type="dxa"/>
+          </w:tcPr>
+          <w:p>
+            <w:pPr>
+              <w:spacing w:after="40"/>
+              <w:rPr>
+                <w:rFonts w:ascii="Calibri" w:hAnsi="Calibri" w:cs="Calibri"/>
+                <w:sz w:val="22"/>
+                <w:szCs w:val="22"/>
+              </w:rPr>
+            </w:pPr>
+            <w:r>
+              <w:rPr>
+                <w:rFonts w:ascii="Calibri" w:hAnsi="Calibri" w:cs="Calibri"/>
+                <w:sz w:val="22"/>
+                <w:szCs w:val="22"/>
+              </w:rPr>
+              <w:t xml:space="preserve">Para detectar las pausas por inactividad se considera actividad, además de las teclas y los clicks, el desplazamiento con la rueda y el movimiento del mouse (secciones 5.3 y 5.6).</w:t>
             </w:r>
           </w:p>
         </w:tc>

</xml_diff>

<commit_message>
docs: Se actualiza documentación del Sprint 03
</commit_message>
<xml_diff>
--- a/FASE 2/Evidencias Proyecto/Documentacion/Documento de arquitectura.docx
+++ b/FASE 2/Evidencias Proyecto/Documentacion/Documento de arquitectura.docx
@@ -4536,7 +4536,7 @@
           <w:sz w:val="22"/>
           <w:szCs w:val="22"/>
         </w:rPr>
-        <w:t>Para los gestos se utiliza MediaPipe Hands, que obtiene 21 puntos de referencia de la mano en tiempo real utilizando solo el procesador (Zhang et al., 2020). Los gestos se clasifican mediante reglas geométricas sobre esos puntos (por ejemplo, la distancia entre las puntas del índice y del pulgar), por lo que no es necesario entrenar un modelo propio. La cámara solo se abre mientras el control por gestos está activado y, si no existe una cámara disponible, el módulo lo informa sin afectar al resto de la aplicación (PB-07).</w:t>
+        <w:t xml:space="preserve">Para los gestos se utiliza MediaPipe Hand Landmarker, la versión actual de MediaPipe Hands, que obtiene 21 puntos de referencia de la mano en tiempo real utilizando solo el procesador (Zhang et al., 2020), tanto en la imagen como en tres dimensiones. Los gestos se clasifican mediante reglas geométricas sobre los puntos en tres dimensiones, cuyas distancias no cambian al girar la mano ni al alejarla de la cámara (por ejemplo, qué tan estirado está cada dedo y la distancia de la punta del pulgar a la base del meñique), por lo que no es necesario entrenar un modelo propio. Los umbrales de cada regla se calibraron con mediciones de una mano real. La cámara solo se abre mientras el control por gestos está activado y, si no existe una cámara disponible, el módulo lo informa sin afectar al resto de la aplicación (PB-07).</w:t>
       </w:r>
     </w:p>
     <w:p>
@@ -4573,6 +4573,437 @@
           <w:szCs w:val="22"/>
         </w:rPr>
         <w:t>El conjunto de gestos reconocidos y de comandos de voz base se mantiene en un catálogo compartido entre la aplicación y la API, que se utiliza para validar los conflictos con los activadores de macros (PB-44).</w:t>
+      </w:r>
+    </w:p>
+    <w:p>
+      <w:pPr>
+        <w:jc w:val="both"/>
+        <w:rPr>
+          <w:rFonts w:ascii="Calibri" w:hAnsi="Calibri" w:cs="Calibri"/>
+          <w:sz w:val="22"/>
+          <w:szCs w:val="22"/>
+        </w:rPr>
+      </w:pPr>
+      <w:r>
+        <w:rPr>
+          <w:rFonts w:ascii="Calibri" w:hAnsi="Calibri" w:cs="Calibri"/>
+          <w:sz w:val="22"/>
+          <w:szCs w:val="22"/>
+        </w:rPr>
+        <w:t xml:space="preserve">En el Sprint 03 se definió el siguiente catálogo de gestos. Todos se realizan con la palma de frente a la cámara y parten de la mano abierta: el pulgar funciona como el botón izquierdo del mouse y el índice como el derecho. El nombre entre paréntesis es el que se utiliza en el catálogo compartido y como activador de las macros.</w:t>
+      </w:r>
+    </w:p>
+    <w:tbl>
+      <w:tblPr>
+        <w:tblW w:w="8838" w:type="dxa"/>
+        <w:tblBorders>
+          <w:top w:val="single" w:sz="4" w:space="0" w:color="808080"/>
+          <w:left w:val="single" w:sz="4" w:space="0" w:color="808080"/>
+          <w:bottom w:val="single" w:sz="4" w:space="0" w:color="808080"/>
+          <w:right w:val="single" w:sz="4" w:space="0" w:color="808080"/>
+          <w:insideH w:val="single" w:sz="4" w:space="0" w:color="808080"/>
+          <w:insideV w:val="single" w:sz="4" w:space="0" w:color="808080"/>
+        </w:tblBorders>
+        <w:tblLayout w:type="fixed"/>
+        <w:tblLook w:val="04A0" w:firstRow="1" w:lastRow="0" w:firstColumn="1" w:lastColumn="0" w:noHBand="0" w:noVBand="1"/>
+      </w:tblPr>
+      <w:tblGrid>
+        <w:gridCol w:w="3000"/>
+        <w:gridCol w:w="5838"/>
+      </w:tblGrid>
+      <w:tr>
+        <w:trPr>
+          <w:cantSplit/>
+          <w:tblHeader/>
+        </w:trPr>
+        <w:tc>
+          <w:tcPr>
+            <w:tcW w:w="3000" w:type="dxa"/>
+            <w:shd w:val="clear" w:color="auto" w:fill="D9E2F3"/>
+          </w:tcPr>
+          <w:p>
+            <w:pPr>
+              <w:keepNext/>
+              <w:spacing w:after="40"/>
+              <w:rPr>
+                <w:rFonts w:ascii="Calibri" w:hAnsi="Calibri" w:cs="Calibri"/>
+                <w:sz w:val="22"/>
+                <w:szCs w:val="22"/>
+              </w:rPr>
+            </w:pPr>
+            <w:r>
+              <w:rPr>
+                <w:rFonts w:ascii="Calibri" w:hAnsi="Calibri" w:cs="Calibri"/>
+                <w:b/>
+                <w:bCs/>
+                <w:sz w:val="22"/>
+                <w:szCs w:val="22"/>
+              </w:rPr>
+              <w:t xml:space="preserve">Gesto</w:t>
+            </w:r>
+          </w:p>
+        </w:tc>
+        <w:tc>
+          <w:tcPr>
+            <w:tcW w:w="5838" w:type="dxa"/>
+            <w:shd w:val="clear" w:color="auto" w:fill="D9E2F3"/>
+          </w:tcPr>
+          <w:p>
+            <w:pPr>
+              <w:keepNext/>
+              <w:spacing w:after="40"/>
+              <w:rPr>
+                <w:rFonts w:ascii="Calibri" w:hAnsi="Calibri" w:cs="Calibri"/>
+                <w:sz w:val="22"/>
+                <w:szCs w:val="22"/>
+              </w:rPr>
+            </w:pPr>
+            <w:r>
+              <w:rPr>
+                <w:rFonts w:ascii="Calibri" w:hAnsi="Calibri" w:cs="Calibri"/>
+                <w:b/>
+                <w:bCs/>
+                <w:sz w:val="22"/>
+                <w:szCs w:val="22"/>
+              </w:rPr>
+              <w:t xml:space="preserve">Acción</w:t>
+            </w:r>
+          </w:p>
+        </w:tc>
+      </w:tr>
+      <w:tr>
+        <w:trPr>
+          <w:cantSplit/>
+        </w:trPr>
+        <w:tc>
+          <w:tcPr>
+            <w:tcW w:w="3000" w:type="dxa"/>
+          </w:tcPr>
+          <w:p>
+            <w:pPr>
+              <w:spacing w:after="40"/>
+              <w:rPr>
+                <w:rFonts w:ascii="Calibri" w:hAnsi="Calibri" w:cs="Calibri"/>
+                <w:sz w:val="22"/>
+                <w:szCs w:val="22"/>
+              </w:rPr>
+            </w:pPr>
+            <w:r>
+              <w:rPr>
+                <w:rFonts w:ascii="Calibri" w:hAnsi="Calibri" w:cs="Calibri"/>
+                <w:sz w:val="22"/>
+                <w:szCs w:val="22"/>
+              </w:rPr>
+              <w:t xml:space="preserve">Mano abierta (point): los cinco dedos estirados.</w:t>
+            </w:r>
+          </w:p>
+        </w:tc>
+        <w:tc>
+          <w:tcPr>
+            <w:tcW w:w="5838" w:type="dxa"/>
+          </w:tcPr>
+          <w:p>
+            <w:pPr>
+              <w:spacing w:after="40"/>
+              <w:rPr>
+                <w:rFonts w:ascii="Calibri" w:hAnsi="Calibri" w:cs="Calibri"/>
+                <w:sz w:val="22"/>
+                <w:szCs w:val="22"/>
+              </w:rPr>
+            </w:pPr>
+            <w:r>
+              <w:rPr>
+                <w:rFonts w:ascii="Calibri" w:hAnsi="Calibri" w:cs="Calibri"/>
+                <w:sz w:val="22"/>
+                <w:szCs w:val="22"/>
+              </w:rPr>
+              <w:t xml:space="preserve">Mover el cursor, que sigue el centro de la palma (PB-09).</w:t>
+            </w:r>
+          </w:p>
+        </w:tc>
+      </w:tr>
+      <w:tr>
+        <w:trPr>
+          <w:cantSplit/>
+        </w:trPr>
+        <w:tc>
+          <w:tcPr>
+            <w:tcW w:w="3000" w:type="dxa"/>
+          </w:tcPr>
+          <w:p>
+            <w:pPr>
+              <w:spacing w:after="40"/>
+              <w:rPr>
+                <w:rFonts w:ascii="Calibri" w:hAnsi="Calibri" w:cs="Calibri"/>
+                <w:sz w:val="22"/>
+                <w:szCs w:val="22"/>
+              </w:rPr>
+            </w:pPr>
+            <w:r>
+              <w:rPr>
+                <w:rFonts w:ascii="Calibri" w:hAnsi="Calibri" w:cs="Calibri"/>
+                <w:sz w:val="22"/>
+                <w:szCs w:val="22"/>
+              </w:rPr>
+              <w:t xml:space="preserve">Pulgar adentro (thumb_in): desde la mano abierta, se dobla solo el pulgar hacia la palma.</w:t>
+            </w:r>
+          </w:p>
+        </w:tc>
+        <w:tc>
+          <w:tcPr>
+            <w:tcW w:w="5838" w:type="dxa"/>
+          </w:tcPr>
+          <w:p>
+            <w:pPr>
+              <w:spacing w:after="40"/>
+              <w:rPr>
+                <w:rFonts w:ascii="Calibri" w:hAnsi="Calibri" w:cs="Calibri"/>
+                <w:sz w:val="22"/>
+                <w:szCs w:val="22"/>
+              </w:rPr>
+            </w:pPr>
+            <w:r>
+              <w:rPr>
+                <w:rFonts w:ascii="Calibri" w:hAnsi="Calibri" w:cs="Calibri"/>
+                <w:sz w:val="22"/>
+                <w:szCs w:val="22"/>
+              </w:rPr>
+              <w:t xml:space="preserve">Click izquierdo; si se mantiene 0,4 s o más, arrastre (PB-10 y PB-11).</w:t>
+            </w:r>
+          </w:p>
+        </w:tc>
+      </w:tr>
+      <w:tr>
+        <w:trPr>
+          <w:cantSplit/>
+        </w:trPr>
+        <w:tc>
+          <w:tcPr>
+            <w:tcW w:w="3000" w:type="dxa"/>
+          </w:tcPr>
+          <w:p>
+            <w:pPr>
+              <w:spacing w:after="40"/>
+              <w:rPr>
+                <w:rFonts w:ascii="Calibri" w:hAnsi="Calibri" w:cs="Calibri"/>
+                <w:sz w:val="22"/>
+                <w:szCs w:val="22"/>
+              </w:rPr>
+            </w:pPr>
+            <w:r>
+              <w:rPr>
+                <w:rFonts w:ascii="Calibri" w:hAnsi="Calibri" w:cs="Calibri"/>
+                <w:sz w:val="22"/>
+                <w:szCs w:val="22"/>
+              </w:rPr>
+              <w:t xml:space="preserve">Índice abajo (index_down): desde la mano abierta, se dobla solo el índice.</w:t>
+            </w:r>
+          </w:p>
+        </w:tc>
+        <w:tc>
+          <w:tcPr>
+            <w:tcW w:w="5838" w:type="dxa"/>
+          </w:tcPr>
+          <w:p>
+            <w:pPr>
+              <w:spacing w:after="40"/>
+              <w:rPr>
+                <w:rFonts w:ascii="Calibri" w:hAnsi="Calibri" w:cs="Calibri"/>
+                <w:sz w:val="22"/>
+                <w:szCs w:val="22"/>
+              </w:rPr>
+            </w:pPr>
+            <w:r>
+              <w:rPr>
+                <w:rFonts w:ascii="Calibri" w:hAnsi="Calibri" w:cs="Calibri"/>
+                <w:sz w:val="22"/>
+                <w:szCs w:val="22"/>
+              </w:rPr>
+              <w:t xml:space="preserve">Click derecho (PB-10).</w:t>
+            </w:r>
+          </w:p>
+        </w:tc>
+      </w:tr>
+      <w:tr>
+        <w:trPr>
+          <w:cantSplit/>
+        </w:trPr>
+        <w:tc>
+          <w:tcPr>
+            <w:tcW w:w="3000" w:type="dxa"/>
+          </w:tcPr>
+          <w:p>
+            <w:pPr>
+              <w:spacing w:after="40"/>
+              <w:rPr>
+                <w:rFonts w:ascii="Calibri" w:hAnsi="Calibri" w:cs="Calibri"/>
+                <w:sz w:val="22"/>
+                <w:szCs w:val="22"/>
+              </w:rPr>
+            </w:pPr>
+            <w:r>
+              <w:rPr>
+                <w:rFonts w:ascii="Calibri" w:hAnsi="Calibri" w:cs="Calibri"/>
+                <w:sz w:val="22"/>
+                <w:szCs w:val="22"/>
+              </w:rPr>
+              <w:t xml:space="preserve">Dos dedos (two_fingers): índice y medio estirados, anular y meñique doblados.</w:t>
+            </w:r>
+          </w:p>
+        </w:tc>
+        <w:tc>
+          <w:tcPr>
+            <w:tcW w:w="5838" w:type="dxa"/>
+          </w:tcPr>
+          <w:p>
+            <w:pPr>
+              <w:spacing w:after="40"/>
+              <w:rPr>
+                <w:rFonts w:ascii="Calibri" w:hAnsi="Calibri" w:cs="Calibri"/>
+                <w:sz w:val="22"/>
+                <w:szCs w:val="22"/>
+              </w:rPr>
+            </w:pPr>
+            <w:r>
+              <w:rPr>
+                <w:rFonts w:ascii="Calibri" w:hAnsi="Calibri" w:cs="Calibri"/>
+                <w:sz w:val="22"/>
+                <w:szCs w:val="22"/>
+              </w:rPr>
+              <w:t xml:space="preserve">Scroll al subir o bajar la mano (PB-12).</w:t>
+            </w:r>
+          </w:p>
+        </w:tc>
+      </w:tr>
+      <w:tr>
+        <w:trPr>
+          <w:cantSplit/>
+        </w:trPr>
+        <w:tc>
+          <w:tcPr>
+            <w:tcW w:w="3000" w:type="dxa"/>
+          </w:tcPr>
+          <w:p>
+            <w:pPr>
+              <w:spacing w:after="40"/>
+              <w:rPr>
+                <w:rFonts w:ascii="Calibri" w:hAnsi="Calibri" w:cs="Calibri"/>
+                <w:sz w:val="22"/>
+                <w:szCs w:val="22"/>
+              </w:rPr>
+            </w:pPr>
+            <w:r>
+              <w:rPr>
+                <w:rFonts w:ascii="Calibri" w:hAnsi="Calibri" w:cs="Calibri"/>
+                <w:sz w:val="22"/>
+                <w:szCs w:val="22"/>
+              </w:rPr>
+              <w:t xml:space="preserve">Puño (fist): todos los dedos doblados.</w:t>
+            </w:r>
+          </w:p>
+        </w:tc>
+        <w:tc>
+          <w:tcPr>
+            <w:tcW w:w="5838" w:type="dxa"/>
+          </w:tcPr>
+          <w:p>
+            <w:pPr>
+              <w:spacing w:after="40"/>
+              <w:rPr>
+                <w:rFonts w:ascii="Calibri" w:hAnsi="Calibri" w:cs="Calibri"/>
+                <w:sz w:val="22"/>
+                <w:szCs w:val="22"/>
+              </w:rPr>
+            </w:pPr>
+            <w:r>
+              <w:rPr>
+                <w:rFonts w:ascii="Calibri" w:hAnsi="Calibri" w:cs="Calibri"/>
+                <w:sz w:val="22"/>
+                <w:szCs w:val="22"/>
+              </w:rPr>
+              <w:t xml:space="preserve">Reservado como activador de macros (Sprint 05).</w:t>
+            </w:r>
+          </w:p>
+        </w:tc>
+      </w:tr>
+      <w:tr>
+        <w:trPr>
+          <w:cantSplit/>
+        </w:trPr>
+        <w:tc>
+          <w:tcPr>
+            <w:tcW w:w="3000" w:type="dxa"/>
+          </w:tcPr>
+          <w:p>
+            <w:pPr>
+              <w:spacing w:after="40"/>
+              <w:rPr>
+                <w:rFonts w:ascii="Calibri" w:hAnsi="Calibri" w:cs="Calibri"/>
+                <w:sz w:val="22"/>
+                <w:szCs w:val="22"/>
+              </w:rPr>
+            </w:pPr>
+            <w:r>
+              <w:rPr>
+                <w:rFonts w:ascii="Calibri" w:hAnsi="Calibri" w:cs="Calibri"/>
+                <w:sz w:val="22"/>
+                <w:szCs w:val="22"/>
+              </w:rPr>
+              <w:t xml:space="preserve">L (l_shape): índice y pulgar estirados, el resto de los dedos doblados.</w:t>
+            </w:r>
+          </w:p>
+        </w:tc>
+        <w:tc>
+          <w:tcPr>
+            <w:tcW w:w="5838" w:type="dxa"/>
+          </w:tcPr>
+          <w:p>
+            <w:pPr>
+              <w:spacing w:after="40"/>
+              <w:rPr>
+                <w:rFonts w:ascii="Calibri" w:hAnsi="Calibri" w:cs="Calibri"/>
+                <w:sz w:val="22"/>
+                <w:szCs w:val="22"/>
+              </w:rPr>
+            </w:pPr>
+            <w:r>
+              <w:rPr>
+                <w:rFonts w:ascii="Calibri" w:hAnsi="Calibri" w:cs="Calibri"/>
+                <w:sz w:val="22"/>
+                <w:szCs w:val="22"/>
+              </w:rPr>
+              <w:t xml:space="preserve">Reservado como activador de macros (Sprint 05).</w:t>
+            </w:r>
+          </w:p>
+        </w:tc>
+      </w:tr>
+    </w:tbl>
+    <w:p>
+      <w:pPr>
+        <w:jc w:val="both"/>
+        <w:rPr>
+          <w:rFonts w:ascii="Calibri" w:hAnsi="Calibri" w:cs="Calibri"/>
+          <w:sz w:val="22"/>
+          <w:szCs w:val="22"/>
+        </w:rPr>
+      </w:pPr>
+    </w:p>
+    <w:p>
+      <w:pPr>
+        <w:jc w:val="both"/>
+        <w:rPr>
+          <w:rFonts w:ascii="Calibri" w:hAnsi="Calibri" w:cs="Calibri"/>
+          <w:sz w:val="22"/>
+          <w:szCs w:val="22"/>
+        </w:rPr>
+      </w:pPr>
+      <w:r>
+        <w:rPr>
+          <w:rFonts w:ascii="Calibri" w:hAnsi="Calibri" w:cs="Calibri"/>
+          <w:sz w:val="22"/>
+          <w:szCs w:val="22"/>
+        </w:rPr>
+        <w:t xml:space="preserve">Para evitar activaciones accidentales (PB-13), un gesto se considera solo si se mantiene durante tres cuadros consecutivos, los umbrales de los clicks usan histéresis, cada click se ejecuta una sola vez por gesto y cualquier otra pose no genera acciones. Como el cursor sigue el centro de la palma, que no se desplaza al doblar el pulgar ni el índice, el click se ejecuta donde se apuntaba.</w:t>
       </w:r>
     </w:p>
     <w:p>
@@ -11349,7 +11780,7 @@
                 <w:sz w:val="22"/>
                 <w:szCs w:val="22"/>
               </w:rPr>
-              <w:t>Visión computacional</w:t>
+              <w:t xml:space="preserve">Visión computacional</w:t>
             </w:r>
           </w:p>
         </w:tc>
@@ -11372,7 +11803,7 @@
                 <w:sz w:val="22"/>
                 <w:szCs w:val="22"/>
               </w:rPr>
-              <w:t>OpenCV y MediaPipe Hands</w:t>
+              <w:t xml:space="preserve">OpenCV y MediaPipe Hand Landmarker</w:t>
             </w:r>
           </w:p>
         </w:tc>
@@ -11395,7 +11826,7 @@
                 <w:sz w:val="22"/>
                 <w:szCs w:val="22"/>
               </w:rPr>
-              <w:t>Captura de la cámara y detección de 21 puntos de la mano.</w:t>
+              <w:t xml:space="preserve">Captura de la cámara y detección de 21 puntos de la mano.</w:t>
             </w:r>
           </w:p>
         </w:tc>
@@ -12890,7 +13321,7 @@
                 <w:sz w:val="22"/>
                 <w:szCs w:val="22"/>
               </w:rPr>
-              <w:t>DA-05</w:t>
+              <w:t xml:space="preserve">DA-05</w:t>
             </w:r>
           </w:p>
         </w:tc>
@@ -12913,7 +13344,7 @@
                 <w:sz w:val="22"/>
                 <w:szCs w:val="22"/>
               </w:rPr>
-              <w:t>MediaPipe Hands con clasificación por reglas.</w:t>
+              <w:t xml:space="preserve">MediaPipe Hand Landmarker con clasificación por reglas.</w:t>
             </w:r>
           </w:p>
         </w:tc>
@@ -12936,7 +13367,7 @@
                 <w:sz w:val="22"/>
                 <w:szCs w:val="22"/>
               </w:rPr>
-              <w:t>Entrenar un modelo propio de gestos.</w:t>
+              <w:t xml:space="preserve">Entrenar un modelo propio de gestos.</w:t>
             </w:r>
           </w:p>
         </w:tc>
@@ -12959,7 +13390,7 @@
                 <w:sz w:val="22"/>
                 <w:szCs w:val="22"/>
               </w:rPr>
-              <w:t>Detección precisa en CPU sin requerir un conjunto de datos; las reglas son explicables y ajustables para reducir activaciones accidentales.</w:t>
+              <w:t xml:space="preserve">Detección precisa en CPU sin requerir un conjunto de datos; las reglas son explicables y ajustables para reducir activaciones accidentales.</w:t>
             </w:r>
           </w:p>
         </w:tc>
@@ -13908,7 +14339,7 @@
                 <w:sz w:val="22"/>
                 <w:szCs w:val="22"/>
               </w:rPr>
-              <w:t>desktop/src/ergosense/gestures/</w:t>
+              <w:t xml:space="preserve">desktop/src/ergosense/gestures/</w:t>
             </w:r>
           </w:p>
         </w:tc>
@@ -13931,7 +14362,7 @@
                 <w:sz w:val="22"/>
                 <w:szCs w:val="22"/>
               </w:rPr>
-              <w:t>Cámara, detección y clasificación de gestos.</w:t>
+              <w:t xml:space="preserve">Cámara, detección y clasificación de gestos, movimiento del cursor e hilo de gestos; incluye el modelo de MediaPipe Hand Landmarker.</w:t>
             </w:r>
           </w:p>
         </w:tc>
@@ -14214,7 +14645,7 @@
                 <w:sz w:val="22"/>
                 <w:szCs w:val="22"/>
               </w:rPr>
-              <w:t>desktop/resources/</w:t>
+              <w:t xml:space="preserve">desktop/resources/</w:t>
             </w:r>
           </w:p>
         </w:tc>
@@ -14237,7 +14668,7 @@
                 <w:sz w:val="22"/>
                 <w:szCs w:val="22"/>
               </w:rPr>
-              <w:t>Modelos de MediaPipe y Vosk, e íconos de la aplicación.</w:t>
+              <w:t xml:space="preserve">Modelo de Vosk e íconos de la aplicación.</w:t>
             </w:r>
           </w:p>
         </w:tc>
@@ -15058,7 +15489,7 @@
                 <w:sz w:val="22"/>
                 <w:szCs w:val="22"/>
               </w:rPr>
-              <w:t>RNF-01, RNF-02</w:t>
+              <w:t xml:space="preserve">RNF-01, RNF-02</w:t>
             </w:r>
           </w:p>
         </w:tc>
@@ -15081,7 +15512,7 @@
                 <w:sz w:val="22"/>
                 <w:szCs w:val="22"/>
               </w:rPr>
-              <w:t>Precisión de gestos y ausencia de activaciones accidentales.</w:t>
+              <w:t xml:space="preserve">Precisión de gestos y ausencia de activaciones accidentales.</w:t>
             </w:r>
           </w:p>
         </w:tc>
@@ -15104,7 +15535,7 @@
                 <w:sz w:val="22"/>
                 <w:szCs w:val="22"/>
               </w:rPr>
-              <w:t>Puntos de MediaPipe, gesto mantenido durante varios cuadros, histéresis y tiempo de espera entre clicks.</w:t>
+              <w:t xml:space="preserve">Puntos 3D de MediaPipe, gesto mantenido durante varios cuadros, histéresis y un solo click por gesto.</w:t>
             </w:r>
           </w:p>
         </w:tc>

</xml_diff>